<commit_message>
Voeg Use cases-practice toe en vertaal werkproductnamen naar het Nederlands
Nieuwe practice "Use cases" met bijbehorende activiteiten, rol
requirements-engineer en werkproducten (use-casemodel,
use-casespecificatie, aanvullende specificaties). Werkproducten van
enterprise/solution/governance-practices hernoemd naar Nederlandse
namen (architectuurvisie, architectuurmodel, architectuurbeslissingen,
enz.) met bijbehorende docx-sjablonen. Voegt RUP-MAPPING.md toe als
naslag voor de RUP-template-equivalenten.

Startpagina en practices-overzicht tonen nu max. 4 practices per rij.

Co-Authored-By: Claude Sonnet 5 <noreply@anthropic.com>
</commit_message>
<xml_diff>
--- a/wptemplates/paved-road.docx
+++ b/wptemplates/paved-road.docx
@@ -91,7 +91,7 @@
                 <w:sz w:val="18"/>
                 <w:szCs w:val="18"/>
               </w:rPr>
-              <w:t xml:space="preserve">Onderwerp</w:t>
+              <w:t xml:space="preserve">Project</w:t>
             </w:r>
           </w:p>
         </w:tc>
@@ -151,7 +151,7 @@
                 <w:sz w:val="18"/>
                 <w:szCs w:val="18"/>
               </w:rPr>
-              <w:t xml:space="preserve">Opgesteld door</w:t>
+              <w:t xml:space="preserve">Versie</w:t>
             </w:r>
           </w:p>
         </w:tc>
@@ -211,7 +211,7 @@
                 <w:sz w:val="18"/>
                 <w:szCs w:val="18"/>
               </w:rPr>
-              <w:t xml:space="preserve">Eigenaar</w:t>
+              <w:t xml:space="preserve">Datum</w:t>
             </w:r>
           </w:p>
         </w:tc>
@@ -244,206 +244,10 @@
           </w:p>
         </w:tc>
       </w:tr>
-      <w:tr>
-        <w:tc>
-          <w:tcPr>
-            <w:tcW w:type="dxa" w:w="2600"/>
-            <w:tcBorders>
-              <w:top w:val="none" w:color="FFFFFF" w:sz="0"/>
-              <w:left w:val="none" w:color="FFFFFF" w:sz="0"/>
-              <w:bottom w:val="none" w:color="FFFFFF" w:sz="0"/>
-              <w:right w:val="none" w:color="FFFFFF" w:sz="0"/>
-            </w:tcBorders>
-            <w:tcMar>
-              <w:top w:type="dxa" w:w="40"/>
-              <w:left w:type="dxa" w:w="0"/>
-              <w:bottom w:type="dxa" w:w="40"/>
-              <w:right w:type="dxa" w:w="100"/>
-            </w:tcMar>
-          </w:tcPr>
-          <w:p>
-            <w:r>
-              <w:rPr>
-                <w:rFonts w:ascii="Calibri" w:cs="Calibri" w:eastAsia="Calibri" w:hAnsi="Calibri"/>
-                <w:b/>
-                <w:bCs/>
-                <w:color w:val="767676"/>
-                <w:sz w:val="18"/>
-                <w:szCs w:val="18"/>
-              </w:rPr>
-              <w:t xml:space="preserve">Versie</w:t>
-            </w:r>
-          </w:p>
-        </w:tc>
-        <w:tc>
-          <w:tcPr>
-            <w:tcW w:type="dxa" w:w="7038"/>
-            <w:tcBorders>
-              <w:top w:val="none" w:color="FFFFFF" w:sz="0"/>
-              <w:left w:val="none" w:color="FFFFFF" w:sz="0"/>
-              <w:bottom w:val="none" w:color="FFFFFF" w:sz="0"/>
-              <w:right w:val="none" w:color="FFFFFF" w:sz="0"/>
-            </w:tcBorders>
-            <w:tcMar>
-              <w:top w:type="dxa" w:w="40"/>
-              <w:left w:type="dxa" w:w="0"/>
-              <w:bottom w:type="dxa" w:w="40"/>
-              <w:right w:type="dxa" w:w="0"/>
-            </w:tcMar>
-          </w:tcPr>
-          <w:p>
-            <w:r>
-              <w:rPr>
-                <w:rFonts w:ascii="Calibri" w:cs="Calibri" w:eastAsia="Calibri" w:hAnsi="Calibri"/>
-                <w:color w:val="404040"/>
-                <w:sz w:val="19"/>
-                <w:szCs w:val="19"/>
-              </w:rPr>
-              <w:t xml:space="preserve">[ … ]</w:t>
-            </w:r>
-          </w:p>
-        </w:tc>
-      </w:tr>
-      <w:tr>
-        <w:tc>
-          <w:tcPr>
-            <w:tcW w:type="dxa" w:w="2600"/>
-            <w:tcBorders>
-              <w:top w:val="none" w:color="FFFFFF" w:sz="0"/>
-              <w:left w:val="none" w:color="FFFFFF" w:sz="0"/>
-              <w:bottom w:val="none" w:color="FFFFFF" w:sz="0"/>
-              <w:right w:val="none" w:color="FFFFFF" w:sz="0"/>
-            </w:tcBorders>
-            <w:tcMar>
-              <w:top w:type="dxa" w:w="40"/>
-              <w:left w:type="dxa" w:w="0"/>
-              <w:bottom w:type="dxa" w:w="40"/>
-              <w:right w:type="dxa" w:w="100"/>
-            </w:tcMar>
-          </w:tcPr>
-          <w:p>
-            <w:r>
-              <w:rPr>
-                <w:rFonts w:ascii="Calibri" w:cs="Calibri" w:eastAsia="Calibri" w:hAnsi="Calibri"/>
-                <w:b/>
-                <w:bCs/>
-                <w:color w:val="767676"/>
-                <w:sz w:val="18"/>
-                <w:szCs w:val="18"/>
-              </w:rPr>
-              <w:t xml:space="preserve">Datum</w:t>
-            </w:r>
-          </w:p>
-        </w:tc>
-        <w:tc>
-          <w:tcPr>
-            <w:tcW w:type="dxa" w:w="7038"/>
-            <w:tcBorders>
-              <w:top w:val="none" w:color="FFFFFF" w:sz="0"/>
-              <w:left w:val="none" w:color="FFFFFF" w:sz="0"/>
-              <w:bottom w:val="none" w:color="FFFFFF" w:sz="0"/>
-              <w:right w:val="none" w:color="FFFFFF" w:sz="0"/>
-            </w:tcBorders>
-            <w:tcMar>
-              <w:top w:type="dxa" w:w="40"/>
-              <w:left w:type="dxa" w:w="0"/>
-              <w:bottom w:type="dxa" w:w="40"/>
-              <w:right w:type="dxa" w:w="0"/>
-            </w:tcMar>
-          </w:tcPr>
-          <w:p>
-            <w:r>
-              <w:rPr>
-                <w:rFonts w:ascii="Calibri" w:cs="Calibri" w:eastAsia="Calibri" w:hAnsi="Calibri"/>
-                <w:color w:val="404040"/>
-                <w:sz w:val="19"/>
-                <w:szCs w:val="19"/>
-              </w:rPr>
-              <w:t xml:space="preserve">[ … ]</w:t>
-            </w:r>
-          </w:p>
-        </w:tc>
-      </w:tr>
-      <w:tr>
-        <w:tc>
-          <w:tcPr>
-            <w:tcW w:type="dxa" w:w="2600"/>
-            <w:tcBorders>
-              <w:top w:val="none" w:color="FFFFFF" w:sz="0"/>
-              <w:left w:val="none" w:color="FFFFFF" w:sz="0"/>
-              <w:bottom w:val="none" w:color="FFFFFF" w:sz="0"/>
-              <w:right w:val="none" w:color="FFFFFF" w:sz="0"/>
-            </w:tcBorders>
-            <w:tcMar>
-              <w:top w:type="dxa" w:w="40"/>
-              <w:left w:type="dxa" w:w="0"/>
-              <w:bottom w:type="dxa" w:w="40"/>
-              <w:right w:type="dxa" w:w="100"/>
-            </w:tcMar>
-          </w:tcPr>
-          <w:p>
-            <w:r>
-              <w:rPr>
-                <w:rFonts w:ascii="Calibri" w:cs="Calibri" w:eastAsia="Calibri" w:hAnsi="Calibri"/>
-                <w:b/>
-                <w:bCs/>
-                <w:color w:val="767676"/>
-                <w:sz w:val="18"/>
-                <w:szCs w:val="18"/>
-              </w:rPr>
-              <w:t xml:space="preserve">Status</w:t>
-            </w:r>
-          </w:p>
-        </w:tc>
-        <w:tc>
-          <w:tcPr>
-            <w:tcW w:type="dxa" w:w="7038"/>
-            <w:tcBorders>
-              <w:top w:val="none" w:color="FFFFFF" w:sz="0"/>
-              <w:left w:val="none" w:color="FFFFFF" w:sz="0"/>
-              <w:bottom w:val="none" w:color="FFFFFF" w:sz="0"/>
-              <w:right w:val="none" w:color="FFFFFF" w:sz="0"/>
-            </w:tcBorders>
-            <w:tcMar>
-              <w:top w:type="dxa" w:w="40"/>
-              <w:left w:type="dxa" w:w="0"/>
-              <w:bottom w:type="dxa" w:w="40"/>
-              <w:right w:type="dxa" w:w="0"/>
-            </w:tcMar>
-          </w:tcPr>
-          <w:p>
-            <w:r>
-              <w:rPr>
-                <w:rFonts w:ascii="Calibri" w:cs="Calibri" w:eastAsia="Calibri" w:hAnsi="Calibri"/>
-                <w:color w:val="404040"/>
-                <w:sz w:val="19"/>
-                <w:szCs w:val="19"/>
-              </w:rPr>
-              <w:t xml:space="preserve">[ … ]</w:t>
-            </w:r>
-          </w:p>
-        </w:tc>
-      </w:tr>
     </w:tbl>
     <w:p>
       <w:pPr>
-        <w:spacing w:after="20" w:before="260"/>
-      </w:pPr>
-      <w:r>
-        <w:rPr>
-          <w:rFonts w:ascii="Calibri" w:cs="Calibri" w:eastAsia="Calibri" w:hAnsi="Calibri"/>
-          <w:b/>
-          <w:bCs/>
-          <w:color w:val="1F3864"/>
-          <w:sz w:val="21"/>
-          <w:szCs w:val="21"/>
-        </w:rPr>
-        <w:t xml:space="preserve">Versiehistorie</w:t>
-      </w:r>
-    </w:p>
-    <w:p>
-      <w:pPr>
-        <w:spacing w:after="60"/>
+        <w:spacing w:after="200" w:before="120"/>
       </w:pPr>
       <w:r>
         <w:rPr>
@@ -454,555 +258,9 @@
           <w:sz w:val="17"/>
           <w:szCs w:val="17"/>
         </w:rPr>
-        <w:t xml:space="preserve">Alleen wijzigingen die de inhoud raken. Een nieuwe versie vervangt de vorige zichtbaar; wie de vorige versie kent, moet hieraan kunnen zien wat er sindsdien is veranderd.</w:t>
-      </w:r>
-    </w:p>
-    <w:tbl>
-      <w:tblPr>
-        <w:tblW w:type="dxa" w:w="9638"/>
-        <w:tblBorders>
-          <w:top w:val="single" w:color="auto" w:sz="4"/>
-          <w:left w:val="single" w:color="auto" w:sz="4"/>
-          <w:bottom w:val="single" w:color="auto" w:sz="4"/>
-          <w:right w:val="single" w:color="auto" w:sz="4"/>
-          <w:insideH w:val="single" w:color="auto" w:sz="4"/>
-          <w:insideV w:val="single" w:color="auto" w:sz="4"/>
-        </w:tblBorders>
-      </w:tblPr>
-      <w:tblGrid>
-        <w:gridCol w:w="900"/>
-        <w:gridCol w:w="1200"/>
-        <w:gridCol w:w="6138"/>
-        <w:gridCol w:w="1400"/>
-      </w:tblGrid>
-      <w:tr>
-        <w:trPr>
-          <w:tblHeader/>
-        </w:trPr>
-        <w:tc>
-          <w:tcPr>
-            <w:tcW w:type="dxa" w:w="900"/>
-            <w:tcBorders>
-              <w:top w:val="single" w:color="BFBFBF" w:sz="2"/>
-              <w:left w:val="single" w:color="BFBFBF" w:sz="2"/>
-              <w:bottom w:val="single" w:color="BFBFBF" w:sz="2"/>
-              <w:right w:val="single" w:color="BFBFBF" w:sz="2"/>
-            </w:tcBorders>
-            <w:shd w:fill="EFF2F7" w:color="auto" w:val="clear"/>
-            <w:tcMar>
-              <w:top w:type="dxa" w:w="60"/>
-              <w:left w:type="dxa" w:w="100"/>
-              <w:bottom w:type="dxa" w:w="60"/>
-              <w:right w:type="dxa" w:w="100"/>
-            </w:tcMar>
-          </w:tcPr>
-          <w:p>
-            <w:r>
-              <w:rPr>
-                <w:rFonts w:ascii="Calibri" w:cs="Calibri" w:eastAsia="Calibri" w:hAnsi="Calibri"/>
-                <w:b/>
-                <w:bCs/>
-                <w:i w:val="false"/>
-                <w:iCs w:val="false"/>
-                <w:color w:val="1F3864"/>
-                <w:sz w:val="19"/>
-                <w:szCs w:val="19"/>
-              </w:rPr>
-              <w:t xml:space="preserve">Versie</w:t>
-            </w:r>
-          </w:p>
-        </w:tc>
-        <w:tc>
-          <w:tcPr>
-            <w:tcW w:type="dxa" w:w="1200"/>
-            <w:tcBorders>
-              <w:top w:val="single" w:color="BFBFBF" w:sz="2"/>
-              <w:left w:val="single" w:color="BFBFBF" w:sz="2"/>
-              <w:bottom w:val="single" w:color="BFBFBF" w:sz="2"/>
-              <w:right w:val="single" w:color="BFBFBF" w:sz="2"/>
-            </w:tcBorders>
-            <w:shd w:fill="EFF2F7" w:color="auto" w:val="clear"/>
-            <w:tcMar>
-              <w:top w:type="dxa" w:w="60"/>
-              <w:left w:type="dxa" w:w="100"/>
-              <w:bottom w:type="dxa" w:w="60"/>
-              <w:right w:type="dxa" w:w="100"/>
-            </w:tcMar>
-          </w:tcPr>
-          <w:p>
-            <w:r>
-              <w:rPr>
-                <w:rFonts w:ascii="Calibri" w:cs="Calibri" w:eastAsia="Calibri" w:hAnsi="Calibri"/>
-                <w:b/>
-                <w:bCs/>
-                <w:i w:val="false"/>
-                <w:iCs w:val="false"/>
-                <w:color w:val="1F3864"/>
-                <w:sz w:val="19"/>
-                <w:szCs w:val="19"/>
-              </w:rPr>
-              <w:t xml:space="preserve">Datum</w:t>
-            </w:r>
-          </w:p>
-        </w:tc>
-        <w:tc>
-          <w:tcPr>
-            <w:tcW w:type="dxa" w:w="6138"/>
-            <w:tcBorders>
-              <w:top w:val="single" w:color="BFBFBF" w:sz="2"/>
-              <w:left w:val="single" w:color="BFBFBF" w:sz="2"/>
-              <w:bottom w:val="single" w:color="BFBFBF" w:sz="2"/>
-              <w:right w:val="single" w:color="BFBFBF" w:sz="2"/>
-            </w:tcBorders>
-            <w:shd w:fill="EFF2F7" w:color="auto" w:val="clear"/>
-            <w:tcMar>
-              <w:top w:type="dxa" w:w="60"/>
-              <w:left w:type="dxa" w:w="100"/>
-              <w:bottom w:type="dxa" w:w="60"/>
-              <w:right w:type="dxa" w:w="100"/>
-            </w:tcMar>
-          </w:tcPr>
-          <w:p>
-            <w:r>
-              <w:rPr>
-                <w:rFonts w:ascii="Calibri" w:cs="Calibri" w:eastAsia="Calibri" w:hAnsi="Calibri"/>
-                <w:b/>
-                <w:bCs/>
-                <w:i w:val="false"/>
-                <w:iCs w:val="false"/>
-                <w:color w:val="1F3864"/>
-                <w:sz w:val="19"/>
-                <w:szCs w:val="19"/>
-              </w:rPr>
-              <w:t xml:space="preserve">Wijziging</w:t>
-            </w:r>
-          </w:p>
-        </w:tc>
-        <w:tc>
-          <w:tcPr>
-            <w:tcW w:type="dxa" w:w="1400"/>
-            <w:tcBorders>
-              <w:top w:val="single" w:color="BFBFBF" w:sz="2"/>
-              <w:left w:val="single" w:color="BFBFBF" w:sz="2"/>
-              <w:bottom w:val="single" w:color="BFBFBF" w:sz="2"/>
-              <w:right w:val="single" w:color="BFBFBF" w:sz="2"/>
-            </w:tcBorders>
-            <w:shd w:fill="EFF2F7" w:color="auto" w:val="clear"/>
-            <w:tcMar>
-              <w:top w:type="dxa" w:w="60"/>
-              <w:left w:type="dxa" w:w="100"/>
-              <w:bottom w:type="dxa" w:w="60"/>
-              <w:right w:type="dxa" w:w="100"/>
-            </w:tcMar>
-          </w:tcPr>
-          <w:p>
-            <w:r>
-              <w:rPr>
-                <w:rFonts w:ascii="Calibri" w:cs="Calibri" w:eastAsia="Calibri" w:hAnsi="Calibri"/>
-                <w:b/>
-                <w:bCs/>
-                <w:i w:val="false"/>
-                <w:iCs w:val="false"/>
-                <w:color w:val="1F3864"/>
-                <w:sz w:val="19"/>
-                <w:szCs w:val="19"/>
-              </w:rPr>
-              <w:t xml:space="preserve">Door</w:t>
-            </w:r>
-          </w:p>
-        </w:tc>
-      </w:tr>
-      <w:tr>
-        <w:tc>
-          <w:tcPr>
-            <w:tcW w:type="dxa" w:w="900"/>
-            <w:tcBorders>
-              <w:top w:val="single" w:color="BFBFBF" w:sz="2"/>
-              <w:left w:val="single" w:color="BFBFBF" w:sz="2"/>
-              <w:bottom w:val="single" w:color="BFBFBF" w:sz="2"/>
-              <w:right w:val="single" w:color="BFBFBF" w:sz="2"/>
-            </w:tcBorders>
-            <w:tcMar>
-              <w:top w:type="dxa" w:w="60"/>
-              <w:left w:type="dxa" w:w="100"/>
-              <w:bottom w:type="dxa" w:w="60"/>
-              <w:right w:type="dxa" w:w="100"/>
-            </w:tcMar>
-          </w:tcPr>
-          <w:p>
-            <w:r>
-              <w:rPr>
-                <w:rFonts w:ascii="Calibri" w:cs="Calibri" w:eastAsia="Calibri" w:hAnsi="Calibri"/>
-                <w:b w:val="false"/>
-                <w:bCs w:val="false"/>
-                <w:i w:val="false"/>
-                <w:iCs w:val="false"/>
-                <w:color w:val="000000"/>
-                <w:sz w:val="19"/>
-                <w:szCs w:val="19"/>
-              </w:rPr>
-              <w:t xml:space="preserve"/>
-            </w:r>
-          </w:p>
-        </w:tc>
-        <w:tc>
-          <w:tcPr>
-            <w:tcW w:type="dxa" w:w="1200"/>
-            <w:tcBorders>
-              <w:top w:val="single" w:color="BFBFBF" w:sz="2"/>
-              <w:left w:val="single" w:color="BFBFBF" w:sz="2"/>
-              <w:bottom w:val="single" w:color="BFBFBF" w:sz="2"/>
-              <w:right w:val="single" w:color="BFBFBF" w:sz="2"/>
-            </w:tcBorders>
-            <w:tcMar>
-              <w:top w:type="dxa" w:w="60"/>
-              <w:left w:type="dxa" w:w="100"/>
-              <w:bottom w:type="dxa" w:w="60"/>
-              <w:right w:type="dxa" w:w="100"/>
-            </w:tcMar>
-          </w:tcPr>
-          <w:p>
-            <w:r>
-              <w:rPr>
-                <w:rFonts w:ascii="Calibri" w:cs="Calibri" w:eastAsia="Calibri" w:hAnsi="Calibri"/>
-                <w:b w:val="false"/>
-                <w:bCs w:val="false"/>
-                <w:i w:val="false"/>
-                <w:iCs w:val="false"/>
-                <w:color w:val="000000"/>
-                <w:sz w:val="19"/>
-                <w:szCs w:val="19"/>
-              </w:rPr>
-              <w:t xml:space="preserve"/>
-            </w:r>
-          </w:p>
-        </w:tc>
-        <w:tc>
-          <w:tcPr>
-            <w:tcW w:type="dxa" w:w="6138"/>
-            <w:tcBorders>
-              <w:top w:val="single" w:color="BFBFBF" w:sz="2"/>
-              <w:left w:val="single" w:color="BFBFBF" w:sz="2"/>
-              <w:bottom w:val="single" w:color="BFBFBF" w:sz="2"/>
-              <w:right w:val="single" w:color="BFBFBF" w:sz="2"/>
-            </w:tcBorders>
-            <w:tcMar>
-              <w:top w:type="dxa" w:w="60"/>
-              <w:left w:type="dxa" w:w="100"/>
-              <w:bottom w:type="dxa" w:w="60"/>
-              <w:right w:type="dxa" w:w="100"/>
-            </w:tcMar>
-          </w:tcPr>
-          <w:p>
-            <w:r>
-              <w:rPr>
-                <w:rFonts w:ascii="Calibri" w:cs="Calibri" w:eastAsia="Calibri" w:hAnsi="Calibri"/>
-                <w:b w:val="false"/>
-                <w:bCs w:val="false"/>
-                <w:i w:val="false"/>
-                <w:iCs w:val="false"/>
-                <w:color w:val="000000"/>
-                <w:sz w:val="19"/>
-                <w:szCs w:val="19"/>
-              </w:rPr>
-              <w:t xml:space="preserve"/>
-            </w:r>
-          </w:p>
-        </w:tc>
-        <w:tc>
-          <w:tcPr>
-            <w:tcW w:type="dxa" w:w="1400"/>
-            <w:tcBorders>
-              <w:top w:val="single" w:color="BFBFBF" w:sz="2"/>
-              <w:left w:val="single" w:color="BFBFBF" w:sz="2"/>
-              <w:bottom w:val="single" w:color="BFBFBF" w:sz="2"/>
-              <w:right w:val="single" w:color="BFBFBF" w:sz="2"/>
-            </w:tcBorders>
-            <w:tcMar>
-              <w:top w:type="dxa" w:w="60"/>
-              <w:left w:type="dxa" w:w="100"/>
-              <w:bottom w:type="dxa" w:w="60"/>
-              <w:right w:type="dxa" w:w="100"/>
-            </w:tcMar>
-          </w:tcPr>
-          <w:p>
-            <w:r>
-              <w:rPr>
-                <w:rFonts w:ascii="Calibri" w:cs="Calibri" w:eastAsia="Calibri" w:hAnsi="Calibri"/>
-                <w:b w:val="false"/>
-                <w:bCs w:val="false"/>
-                <w:i w:val="false"/>
-                <w:iCs w:val="false"/>
-                <w:color w:val="000000"/>
-                <w:sz w:val="19"/>
-                <w:szCs w:val="19"/>
-              </w:rPr>
-              <w:t xml:space="preserve"/>
-            </w:r>
-          </w:p>
-        </w:tc>
-      </w:tr>
-      <w:tr>
-        <w:tc>
-          <w:tcPr>
-            <w:tcW w:type="dxa" w:w="900"/>
-            <w:tcBorders>
-              <w:top w:val="single" w:color="BFBFBF" w:sz="2"/>
-              <w:left w:val="single" w:color="BFBFBF" w:sz="2"/>
-              <w:bottom w:val="single" w:color="BFBFBF" w:sz="2"/>
-              <w:right w:val="single" w:color="BFBFBF" w:sz="2"/>
-            </w:tcBorders>
-            <w:tcMar>
-              <w:top w:type="dxa" w:w="60"/>
-              <w:left w:type="dxa" w:w="100"/>
-              <w:bottom w:type="dxa" w:w="60"/>
-              <w:right w:type="dxa" w:w="100"/>
-            </w:tcMar>
-          </w:tcPr>
-          <w:p>
-            <w:r>
-              <w:rPr>
-                <w:rFonts w:ascii="Calibri" w:cs="Calibri" w:eastAsia="Calibri" w:hAnsi="Calibri"/>
-                <w:b w:val="false"/>
-                <w:bCs w:val="false"/>
-                <w:i w:val="false"/>
-                <w:iCs w:val="false"/>
-                <w:color w:val="000000"/>
-                <w:sz w:val="19"/>
-                <w:szCs w:val="19"/>
-              </w:rPr>
-              <w:t xml:space="preserve"/>
-            </w:r>
-          </w:p>
-        </w:tc>
-        <w:tc>
-          <w:tcPr>
-            <w:tcW w:type="dxa" w:w="1200"/>
-            <w:tcBorders>
-              <w:top w:val="single" w:color="BFBFBF" w:sz="2"/>
-              <w:left w:val="single" w:color="BFBFBF" w:sz="2"/>
-              <w:bottom w:val="single" w:color="BFBFBF" w:sz="2"/>
-              <w:right w:val="single" w:color="BFBFBF" w:sz="2"/>
-            </w:tcBorders>
-            <w:tcMar>
-              <w:top w:type="dxa" w:w="60"/>
-              <w:left w:type="dxa" w:w="100"/>
-              <w:bottom w:type="dxa" w:w="60"/>
-              <w:right w:type="dxa" w:w="100"/>
-            </w:tcMar>
-          </w:tcPr>
-          <w:p>
-            <w:r>
-              <w:rPr>
-                <w:rFonts w:ascii="Calibri" w:cs="Calibri" w:eastAsia="Calibri" w:hAnsi="Calibri"/>
-                <w:b w:val="false"/>
-                <w:bCs w:val="false"/>
-                <w:i w:val="false"/>
-                <w:iCs w:val="false"/>
-                <w:color w:val="000000"/>
-                <w:sz w:val="19"/>
-                <w:szCs w:val="19"/>
-              </w:rPr>
-              <w:t xml:space="preserve"/>
-            </w:r>
-          </w:p>
-        </w:tc>
-        <w:tc>
-          <w:tcPr>
-            <w:tcW w:type="dxa" w:w="6138"/>
-            <w:tcBorders>
-              <w:top w:val="single" w:color="BFBFBF" w:sz="2"/>
-              <w:left w:val="single" w:color="BFBFBF" w:sz="2"/>
-              <w:bottom w:val="single" w:color="BFBFBF" w:sz="2"/>
-              <w:right w:val="single" w:color="BFBFBF" w:sz="2"/>
-            </w:tcBorders>
-            <w:tcMar>
-              <w:top w:type="dxa" w:w="60"/>
-              <w:left w:type="dxa" w:w="100"/>
-              <w:bottom w:type="dxa" w:w="60"/>
-              <w:right w:type="dxa" w:w="100"/>
-            </w:tcMar>
-          </w:tcPr>
-          <w:p>
-            <w:r>
-              <w:rPr>
-                <w:rFonts w:ascii="Calibri" w:cs="Calibri" w:eastAsia="Calibri" w:hAnsi="Calibri"/>
-                <w:b w:val="false"/>
-                <w:bCs w:val="false"/>
-                <w:i w:val="false"/>
-                <w:iCs w:val="false"/>
-                <w:color w:val="000000"/>
-                <w:sz w:val="19"/>
-                <w:szCs w:val="19"/>
-              </w:rPr>
-              <w:t xml:space="preserve"/>
-            </w:r>
-          </w:p>
-        </w:tc>
-        <w:tc>
-          <w:tcPr>
-            <w:tcW w:type="dxa" w:w="1400"/>
-            <w:tcBorders>
-              <w:top w:val="single" w:color="BFBFBF" w:sz="2"/>
-              <w:left w:val="single" w:color="BFBFBF" w:sz="2"/>
-              <w:bottom w:val="single" w:color="BFBFBF" w:sz="2"/>
-              <w:right w:val="single" w:color="BFBFBF" w:sz="2"/>
-            </w:tcBorders>
-            <w:tcMar>
-              <w:top w:type="dxa" w:w="60"/>
-              <w:left w:type="dxa" w:w="100"/>
-              <w:bottom w:type="dxa" w:w="60"/>
-              <w:right w:type="dxa" w:w="100"/>
-            </w:tcMar>
-          </w:tcPr>
-          <w:p>
-            <w:r>
-              <w:rPr>
-                <w:rFonts w:ascii="Calibri" w:cs="Calibri" w:eastAsia="Calibri" w:hAnsi="Calibri"/>
-                <w:b w:val="false"/>
-                <w:bCs w:val="false"/>
-                <w:i w:val="false"/>
-                <w:iCs w:val="false"/>
-                <w:color w:val="000000"/>
-                <w:sz w:val="19"/>
-                <w:szCs w:val="19"/>
-              </w:rPr>
-              <w:t xml:space="preserve"/>
-            </w:r>
-          </w:p>
-        </w:tc>
-      </w:tr>
-      <w:tr>
-        <w:tc>
-          <w:tcPr>
-            <w:tcW w:type="dxa" w:w="900"/>
-            <w:tcBorders>
-              <w:top w:val="single" w:color="BFBFBF" w:sz="2"/>
-              <w:left w:val="single" w:color="BFBFBF" w:sz="2"/>
-              <w:bottom w:val="single" w:color="BFBFBF" w:sz="2"/>
-              <w:right w:val="single" w:color="BFBFBF" w:sz="2"/>
-            </w:tcBorders>
-            <w:tcMar>
-              <w:top w:type="dxa" w:w="60"/>
-              <w:left w:type="dxa" w:w="100"/>
-              <w:bottom w:type="dxa" w:w="60"/>
-              <w:right w:type="dxa" w:w="100"/>
-            </w:tcMar>
-          </w:tcPr>
-          <w:p>
-            <w:r>
-              <w:rPr>
-                <w:rFonts w:ascii="Calibri" w:cs="Calibri" w:eastAsia="Calibri" w:hAnsi="Calibri"/>
-                <w:b w:val="false"/>
-                <w:bCs w:val="false"/>
-                <w:i w:val="false"/>
-                <w:iCs w:val="false"/>
-                <w:color w:val="000000"/>
-                <w:sz w:val="19"/>
-                <w:szCs w:val="19"/>
-              </w:rPr>
-              <w:t xml:space="preserve"/>
-            </w:r>
-          </w:p>
-        </w:tc>
-        <w:tc>
-          <w:tcPr>
-            <w:tcW w:type="dxa" w:w="1200"/>
-            <w:tcBorders>
-              <w:top w:val="single" w:color="BFBFBF" w:sz="2"/>
-              <w:left w:val="single" w:color="BFBFBF" w:sz="2"/>
-              <w:bottom w:val="single" w:color="BFBFBF" w:sz="2"/>
-              <w:right w:val="single" w:color="BFBFBF" w:sz="2"/>
-            </w:tcBorders>
-            <w:tcMar>
-              <w:top w:type="dxa" w:w="60"/>
-              <w:left w:type="dxa" w:w="100"/>
-              <w:bottom w:type="dxa" w:w="60"/>
-              <w:right w:type="dxa" w:w="100"/>
-            </w:tcMar>
-          </w:tcPr>
-          <w:p>
-            <w:r>
-              <w:rPr>
-                <w:rFonts w:ascii="Calibri" w:cs="Calibri" w:eastAsia="Calibri" w:hAnsi="Calibri"/>
-                <w:b w:val="false"/>
-                <w:bCs w:val="false"/>
-                <w:i w:val="false"/>
-                <w:iCs w:val="false"/>
-                <w:color w:val="000000"/>
-                <w:sz w:val="19"/>
-                <w:szCs w:val="19"/>
-              </w:rPr>
-              <w:t xml:space="preserve"/>
-            </w:r>
-          </w:p>
-        </w:tc>
-        <w:tc>
-          <w:tcPr>
-            <w:tcW w:type="dxa" w:w="6138"/>
-            <w:tcBorders>
-              <w:top w:val="single" w:color="BFBFBF" w:sz="2"/>
-              <w:left w:val="single" w:color="BFBFBF" w:sz="2"/>
-              <w:bottom w:val="single" w:color="BFBFBF" w:sz="2"/>
-              <w:right w:val="single" w:color="BFBFBF" w:sz="2"/>
-            </w:tcBorders>
-            <w:tcMar>
-              <w:top w:type="dxa" w:w="60"/>
-              <w:left w:type="dxa" w:w="100"/>
-              <w:bottom w:type="dxa" w:w="60"/>
-              <w:right w:type="dxa" w:w="100"/>
-            </w:tcMar>
-          </w:tcPr>
-          <w:p>
-            <w:r>
-              <w:rPr>
-                <w:rFonts w:ascii="Calibri" w:cs="Calibri" w:eastAsia="Calibri" w:hAnsi="Calibri"/>
-                <w:b w:val="false"/>
-                <w:bCs w:val="false"/>
-                <w:i w:val="false"/>
-                <w:iCs w:val="false"/>
-                <w:color w:val="000000"/>
-                <w:sz w:val="19"/>
-                <w:szCs w:val="19"/>
-              </w:rPr>
-              <w:t xml:space="preserve"/>
-            </w:r>
-          </w:p>
-        </w:tc>
-        <w:tc>
-          <w:tcPr>
-            <w:tcW w:type="dxa" w:w="1400"/>
-            <w:tcBorders>
-              <w:top w:val="single" w:color="BFBFBF" w:sz="2"/>
-              <w:left w:val="single" w:color="BFBFBF" w:sz="2"/>
-              <w:bottom w:val="single" w:color="BFBFBF" w:sz="2"/>
-              <w:right w:val="single" w:color="BFBFBF" w:sz="2"/>
-            </w:tcBorders>
-            <w:tcMar>
-              <w:top w:type="dxa" w:w="60"/>
-              <w:left w:type="dxa" w:w="100"/>
-              <w:bottom w:type="dxa" w:w="60"/>
-              <w:right w:type="dxa" w:w="100"/>
-            </w:tcMar>
-          </w:tcPr>
-          <w:p>
-            <w:r>
-              <w:rPr>
-                <w:rFonts w:ascii="Calibri" w:cs="Calibri" w:eastAsia="Calibri" w:hAnsi="Calibri"/>
-                <w:b w:val="false"/>
-                <w:bCs w:val="false"/>
-                <w:i w:val="false"/>
-                <w:iCs w:val="false"/>
-                <w:color w:val="000000"/>
-                <w:sz w:val="19"/>
-                <w:szCs w:val="19"/>
-              </w:rPr>
-              <w:t xml:space="preserve"/>
-            </w:r>
-          </w:p>
-        </w:tc>
-      </w:tr>
-    </w:tbl>
+        <w:t xml:space="preserve">Het versienummer geeft de status weer, volgens major.minor.patch. 0.y.z is een concept dat nog niet is vastgesteld; 1.0.0 is de eerste vastgestelde versie. Verhoog de patch bij een tekstuele correctie, de minor bij een aanvulling die verenigbaar is met de vorige versie, en de major bij een wijziging die een eerder besluit raakt en dus opnieuw moet worden vastgesteld.</w:t>
+      </w:r>
+    </w:p>
     <w:p>
       <w:pPr>
         <w:spacing w:after="200" w:before="120"/>
@@ -2452,7 +1710,7 @@
           <w:sz w:val="21"/>
           <w:szCs w:val="21"/>
         </w:rPr>
-        <w:t xml:space="preserve">Standaardinrichting per klasse</w:t>
+        <w:t xml:space="preserve">Uitwerking per item</w:t>
       </w:r>
     </w:p>
     <w:p>
@@ -2468,7 +1726,276 @@
           <w:sz w:val="17"/>
           <w:szCs w:val="17"/>
         </w:rPr>
-        <w:t xml:space="preserve">Per classificatie de inrichting die standaard geldt, zodat een team niet per geval opnieuw hoeft uit te zoeken welke maatregelen nodig zijn. De classificatie zelf komt van buiten deze methode; hier staat alleen wat ze binnen de gebaande weg betekent.</w:t>
+        <w:t xml:space="preserve">Een catalogusregel vertelt een team nog niet hoe het iets gebruikt. Werk elk item hieronder uit tot het punt waarop iemand er zonder overleg mee aan de slag kan; dat is het verschil tussen een route en een lijst.</w:t>
+      </w:r>
+    </w:p>
+    <w:p>
+      <w:pPr>
+        <w:spacing w:after="20" w:before="200"/>
+      </w:pPr>
+      <w:r>
+        <w:rPr>
+          <w:rFonts w:ascii="Calibri" w:cs="Calibri" w:eastAsia="Calibri" w:hAnsi="Calibri"/>
+          <w:b/>
+          <w:bCs/>
+          <w:color w:val="1F3864"/>
+          <w:sz w:val="19"/>
+          <w:szCs w:val="19"/>
+        </w:rPr>
+        <w:t xml:space="preserve">Item 1 — [ naam ]</w:t>
+      </w:r>
+    </w:p>
+    <w:p>
+      <w:pPr>
+        <w:spacing w:after="20" w:before="80"/>
+      </w:pPr>
+      <w:r>
+        <w:rPr>
+          <w:rFonts w:ascii="Calibri" w:cs="Calibri" w:eastAsia="Calibri" w:hAnsi="Calibri"/>
+          <w:b/>
+          <w:bCs/>
+          <w:color w:val="404040"/>
+          <w:sz w:val="18"/>
+          <w:szCs w:val="18"/>
+        </w:rPr>
+        <w:t xml:space="preserve">Waarvoor bedoeld  </w:t>
+      </w:r>
+      <w:r>
+        <w:rPr>
+          <w:rFonts w:ascii="Calibri" w:cs="Calibri" w:eastAsia="Calibri" w:hAnsi="Calibri"/>
+          <w:i/>
+          <w:iCs/>
+          <w:color w:val="767676"/>
+          <w:sz w:val="17"/>
+          <w:szCs w:val="17"/>
+        </w:rPr>
+        <w:t xml:space="preserve">welk probleem dit item oplost, en in welke situaties het de aangewezen keuze is.</w:t>
+      </w:r>
+    </w:p>
+    <w:p>
+      <w:pPr>
+        <w:spacing w:after="40"/>
+      </w:pPr>
+      <w:r>
+        <w:rPr>
+          <w:rFonts w:ascii="Calibri" w:cs="Calibri" w:eastAsia="Calibri" w:hAnsi="Calibri"/>
+          <w:color w:val="404040"/>
+          <w:sz w:val="20"/>
+          <w:szCs w:val="20"/>
+        </w:rPr>
+        <w:t xml:space="preserve">[ … ]</w:t>
+      </w:r>
+    </w:p>
+    <w:p>
+      <w:pPr>
+        <w:spacing w:after="20" w:before="80"/>
+      </w:pPr>
+      <w:r>
+        <w:rPr>
+          <w:rFonts w:ascii="Calibri" w:cs="Calibri" w:eastAsia="Calibri" w:hAnsi="Calibri"/>
+          <w:b/>
+          <w:bCs/>
+          <w:color w:val="404040"/>
+          <w:sz w:val="18"/>
+          <w:szCs w:val="18"/>
+        </w:rPr>
+        <w:t xml:space="preserve">Hoe te gebruiken  </w:t>
+      </w:r>
+      <w:r>
+        <w:rPr>
+          <w:rFonts w:ascii="Calibri" w:cs="Calibri" w:eastAsia="Calibri" w:hAnsi="Calibri"/>
+          <w:i/>
+          <w:iCs/>
+          <w:color w:val="767676"/>
+          <w:sz w:val="17"/>
+          <w:szCs w:val="17"/>
+        </w:rPr>
+        <w:t xml:space="preserve">de kortste weg naar werkend gebruik: waar het vandaan komt, hoe het wordt aangesloten, waar het voorbeeld staat.</w:t>
+      </w:r>
+    </w:p>
+    <w:p>
+      <w:pPr>
+        <w:spacing w:after="40"/>
+      </w:pPr>
+      <w:r>
+        <w:rPr>
+          <w:rFonts w:ascii="Calibri" w:cs="Calibri" w:eastAsia="Calibri" w:hAnsi="Calibri"/>
+          <w:color w:val="404040"/>
+          <w:sz w:val="20"/>
+          <w:szCs w:val="20"/>
+        </w:rPr>
+        <w:t xml:space="preserve">[ … ]</w:t>
+      </w:r>
+    </w:p>
+    <w:p>
+      <w:pPr>
+        <w:spacing w:after="20" w:before="80"/>
+      </w:pPr>
+      <w:r>
+        <w:rPr>
+          <w:rFonts w:ascii="Calibri" w:cs="Calibri" w:eastAsia="Calibri" w:hAnsi="Calibri"/>
+          <w:b/>
+          <w:bCs/>
+          <w:color w:val="404040"/>
+          <w:sz w:val="18"/>
+          <w:szCs w:val="18"/>
+        </w:rPr>
+        <w:t xml:space="preserve">Standaardinstellingen  </w:t>
+      </w:r>
+      <w:r>
+        <w:rPr>
+          <w:rFonts w:ascii="Calibri" w:cs="Calibri" w:eastAsia="Calibri" w:hAnsi="Calibri"/>
+          <w:i/>
+          <w:iCs/>
+          <w:color w:val="767676"/>
+          <w:sz w:val="17"/>
+          <w:szCs w:val="17"/>
+        </w:rPr>
+        <w:t xml:space="preserve">de instellingen die al goedgekeurd zijn, zodat een team ze niet zelf hoeft af te leiden.</w:t>
+      </w:r>
+    </w:p>
+    <w:p>
+      <w:pPr>
+        <w:spacing w:after="40"/>
+      </w:pPr>
+      <w:r>
+        <w:rPr>
+          <w:rFonts w:ascii="Calibri" w:cs="Calibri" w:eastAsia="Calibri" w:hAnsi="Calibri"/>
+          <w:color w:val="404040"/>
+          <w:sz w:val="20"/>
+          <w:szCs w:val="20"/>
+        </w:rPr>
+        <w:t xml:space="preserve">[ … ]</w:t>
+      </w:r>
+    </w:p>
+    <w:p>
+      <w:pPr>
+        <w:spacing w:after="20" w:before="80"/>
+      </w:pPr>
+      <w:r>
+        <w:rPr>
+          <w:rFonts w:ascii="Calibri" w:cs="Calibri" w:eastAsia="Calibri" w:hAnsi="Calibri"/>
+          <w:b/>
+          <w:bCs/>
+          <w:color w:val="404040"/>
+          <w:sz w:val="18"/>
+          <w:szCs w:val="18"/>
+        </w:rPr>
+        <w:t xml:space="preserve">Wat het niet dekt  </w:t>
+      </w:r>
+      <w:r>
+        <w:rPr>
+          <w:rFonts w:ascii="Calibri" w:cs="Calibri" w:eastAsia="Calibri" w:hAnsi="Calibri"/>
+          <w:i/>
+          <w:iCs/>
+          <w:color w:val="767676"/>
+          <w:sz w:val="17"/>
+          <w:szCs w:val="17"/>
+        </w:rPr>
+        <w:t xml:space="preserve">de gevallen waarvoor dit item níet bedoeld is. Zonder deze grens wordt het item vroeg of laat verkeerd ingezet.</w:t>
+      </w:r>
+    </w:p>
+    <w:p>
+      <w:pPr>
+        <w:spacing w:after="40"/>
+      </w:pPr>
+      <w:r>
+        <w:rPr>
+          <w:rFonts w:ascii="Calibri" w:cs="Calibri" w:eastAsia="Calibri" w:hAnsi="Calibri"/>
+          <w:color w:val="404040"/>
+          <w:sz w:val="20"/>
+          <w:szCs w:val="20"/>
+        </w:rPr>
+        <w:t xml:space="preserve">[ … ]</w:t>
+      </w:r>
+    </w:p>
+    <w:p>
+      <w:pPr>
+        <w:spacing w:after="20" w:before="80"/>
+      </w:pPr>
+      <w:r>
+        <w:rPr>
+          <w:rFonts w:ascii="Calibri" w:cs="Calibri" w:eastAsia="Calibri" w:hAnsi="Calibri"/>
+          <w:b/>
+          <w:bCs/>
+          <w:color w:val="404040"/>
+          <w:sz w:val="18"/>
+          <w:szCs w:val="18"/>
+        </w:rPr>
+        <w:t xml:space="preserve">Aanspreekpunt  </w:t>
+      </w:r>
+      <w:r>
+        <w:rPr>
+          <w:rFonts w:ascii="Calibri" w:cs="Calibri" w:eastAsia="Calibri" w:hAnsi="Calibri"/>
+          <w:i/>
+          <w:iCs/>
+          <w:color w:val="767676"/>
+          <w:sz w:val="17"/>
+          <w:szCs w:val="17"/>
+        </w:rPr>
+        <w:t xml:space="preserve">wie helpt als het niet lukt, en waar de vragen binnenkomen.</w:t>
+      </w:r>
+    </w:p>
+    <w:p>
+      <w:pPr>
+        <w:spacing w:after="40"/>
+      </w:pPr>
+      <w:r>
+        <w:rPr>
+          <w:rFonts w:ascii="Calibri" w:cs="Calibri" w:eastAsia="Calibri" w:hAnsi="Calibri"/>
+          <w:color w:val="404040"/>
+          <w:sz w:val="20"/>
+          <w:szCs w:val="20"/>
+        </w:rPr>
+        <w:t xml:space="preserve">[ … ]</w:t>
+      </w:r>
+    </w:p>
+    <w:p>
+      <w:pPr>
+        <w:spacing w:after="40" w:before="140"/>
+      </w:pPr>
+      <w:r>
+        <w:rPr>
+          <w:rFonts w:ascii="Calibri" w:cs="Calibri" w:eastAsia="Calibri" w:hAnsi="Calibri"/>
+          <w:i/>
+          <w:iCs/>
+          <w:color w:val="767676"/>
+          <w:sz w:val="17"/>
+          <w:szCs w:val="17"/>
+        </w:rPr>
+        <w:t xml:space="preserve">Herhaal dit blok per item dat toelichting nodig heeft.</w:t>
+      </w:r>
+    </w:p>
+    <w:p>
+      <w:pPr>
+        <w:spacing w:after="20" w:before="260"/>
+      </w:pPr>
+      <w:r>
+        <w:rPr>
+          <w:rFonts w:ascii="Calibri" w:cs="Calibri" w:eastAsia="Calibri" w:hAnsi="Calibri"/>
+          <w:b/>
+          <w:bCs/>
+          <w:color w:val="1F3864"/>
+          <w:sz w:val="21"/>
+          <w:szCs w:val="21"/>
+        </w:rPr>
+        <w:t xml:space="preserve">Wat de route standaard al regelt</w:t>
+      </w:r>
+    </w:p>
+    <w:p>
+      <w:pPr>
+        <w:spacing w:after="60"/>
+      </w:pPr>
+      <w:r>
+        <w:rPr>
+          <w:rFonts w:ascii="Calibri" w:cs="Calibri" w:eastAsia="Calibri" w:hAnsi="Calibri"/>
+          <w:i/>
+          <w:iCs/>
+          <w:color w:val="767676"/>
+          <w:sz w:val="17"/>
+          <w:szCs w:val="17"/>
+        </w:rPr>
+        <w:t xml:space="preserve">De terugkerende onderwerpen waarvoor de route een vastgestelde invulling kent — foutafhandeling en herstelgedrag, logging en herleidbaarheid, geheimen en sleutels, overdraagbaarheid tussen omgevingen, hergebruik. Wat hier staat, hoeft een team niet zelf te bedenken en wordt ook niet opnieuw beoordeeld.</w:t>
       </w:r>
     </w:p>
     <w:tbl>
@@ -2484,10 +2011,9 @@
         </w:tblBorders>
       </w:tblPr>
       <w:tblGrid>
-        <w:gridCol w:w="1400"/>
-        <w:gridCol w:w="2600"/>
-        <w:gridCol w:w="3400"/>
-        <w:gridCol w:w="2238"/>
+        <w:gridCol w:w="3212"/>
+        <w:gridCol w:w="3212"/>
+        <w:gridCol w:w="3214"/>
       </w:tblGrid>
       <w:tr>
         <w:trPr>
@@ -2495,7 +2021,7 @@
         </w:trPr>
         <w:tc>
           <w:tcPr>
-            <w:tcW w:type="dxa" w:w="1400"/>
+            <w:tcW w:type="dxa" w:w="3212"/>
             <w:tcBorders>
               <w:top w:val="single" w:color="BFBFBF" w:sz="2"/>
               <w:left w:val="single" w:color="BFBFBF" w:sz="2"/>
@@ -2522,13 +2048,13 @@
                 <w:sz w:val="19"/>
                 <w:szCs w:val="19"/>
               </w:rPr>
-              <w:t xml:space="preserve">Klasse</w:t>
-            </w:r>
-          </w:p>
-        </w:tc>
-        <w:tc>
-          <w:tcPr>
-            <w:tcW w:type="dxa" w:w="2600"/>
+              <w:t xml:space="preserve">Onderwerp</w:t>
+            </w:r>
+          </w:p>
+        </w:tc>
+        <w:tc>
+          <w:tcPr>
+            <w:tcW w:type="dxa" w:w="3212"/>
             <w:tcBorders>
               <w:top w:val="single" w:color="BFBFBF" w:sz="2"/>
               <w:left w:val="single" w:color="BFBFBF" w:sz="2"/>
@@ -2555,13 +2081,13 @@
                 <w:sz w:val="19"/>
                 <w:szCs w:val="19"/>
               </w:rPr>
-              <w:t xml:space="preserve">Wat erin valt</w:t>
-            </w:r>
-          </w:p>
-        </w:tc>
-        <w:tc>
-          <w:tcPr>
-            <w:tcW w:type="dxa" w:w="3400"/>
+              <w:t xml:space="preserve">Wat de route regelt</w:t>
+            </w:r>
+          </w:p>
+        </w:tc>
+        <w:tc>
+          <w:tcPr>
+            <w:tcW w:type="dxa" w:w="3214"/>
             <w:tcBorders>
               <w:top w:val="single" w:color="BFBFBF" w:sz="2"/>
               <w:left w:val="single" w:color="BFBFBF" w:sz="2"/>
@@ -2588,40 +2114,7 @@
                 <w:sz w:val="19"/>
                 <w:szCs w:val="19"/>
               </w:rPr>
-              <w:t xml:space="preserve">Verplichte inrichting</w:t>
-            </w:r>
-          </w:p>
-        </w:tc>
-        <w:tc>
-          <w:tcPr>
-            <w:tcW w:type="dxa" w:w="2238"/>
-            <w:tcBorders>
-              <w:top w:val="single" w:color="BFBFBF" w:sz="2"/>
-              <w:left w:val="single" w:color="BFBFBF" w:sz="2"/>
-              <w:bottom w:val="single" w:color="BFBFBF" w:sz="2"/>
-              <w:right w:val="single" w:color="BFBFBF" w:sz="2"/>
-            </w:tcBorders>
-            <w:shd w:fill="EFF2F7" w:color="auto" w:val="clear"/>
-            <w:tcMar>
-              <w:top w:type="dxa" w:w="60"/>
-              <w:left w:type="dxa" w:w="100"/>
-              <w:bottom w:type="dxa" w:w="60"/>
-              <w:right w:type="dxa" w:w="100"/>
-            </w:tcMar>
-          </w:tcPr>
-          <w:p>
-            <w:r>
-              <w:rPr>
-                <w:rFonts w:ascii="Calibri" w:cs="Calibri" w:eastAsia="Calibri" w:hAnsi="Calibri"/>
-                <w:b/>
-                <w:bCs/>
-                <w:i w:val="false"/>
-                <w:iCs w:val="false"/>
-                <w:color w:val="1F3864"/>
-                <w:sz w:val="19"/>
-                <w:szCs w:val="19"/>
-              </w:rPr>
-              <w:t xml:space="preserve">Waar geregeld</w:t>
+              <w:t xml:space="preserve">Waar het staat</w:t>
             </w:r>
           </w:p>
         </w:tc>
@@ -2629,103 +2122,71 @@
       <w:tr>
         <w:tc>
           <w:tcPr>
-            <w:tcW w:type="dxa" w:w="1400"/>
-            <w:tcBorders>
-              <w:top w:val="single" w:color="BFBFBF" w:sz="2"/>
-              <w:left w:val="single" w:color="BFBFBF" w:sz="2"/>
-              <w:bottom w:val="single" w:color="BFBFBF" w:sz="2"/>
-              <w:right w:val="single" w:color="BFBFBF" w:sz="2"/>
-            </w:tcBorders>
-            <w:tcMar>
-              <w:top w:type="dxa" w:w="60"/>
-              <w:left w:type="dxa" w:w="100"/>
-              <w:bottom w:type="dxa" w:w="60"/>
-              <w:right w:type="dxa" w:w="100"/>
-            </w:tcMar>
-          </w:tcPr>
-          <w:p>
-            <w:r>
-              <w:rPr>
-                <w:rFonts w:ascii="Calibri" w:cs="Calibri" w:eastAsia="Calibri" w:hAnsi="Calibri"/>
-                <w:b w:val="false"/>
-                <w:bCs w:val="false"/>
-                <w:i w:val="false"/>
-                <w:iCs w:val="false"/>
-                <w:color w:val="000000"/>
-                <w:sz w:val="19"/>
-                <w:szCs w:val="19"/>
-              </w:rPr>
-              <w:t xml:space="preserve"/>
-            </w:r>
-          </w:p>
-        </w:tc>
-        <w:tc>
-          <w:tcPr>
-            <w:tcW w:type="dxa" w:w="2600"/>
-            <w:tcBorders>
-              <w:top w:val="single" w:color="BFBFBF" w:sz="2"/>
-              <w:left w:val="single" w:color="BFBFBF" w:sz="2"/>
-              <w:bottom w:val="single" w:color="BFBFBF" w:sz="2"/>
-              <w:right w:val="single" w:color="BFBFBF" w:sz="2"/>
-            </w:tcBorders>
-            <w:tcMar>
-              <w:top w:type="dxa" w:w="60"/>
-              <w:left w:type="dxa" w:w="100"/>
-              <w:bottom w:type="dxa" w:w="60"/>
-              <w:right w:type="dxa" w:w="100"/>
-            </w:tcMar>
-          </w:tcPr>
-          <w:p>
-            <w:r>
-              <w:rPr>
-                <w:rFonts w:ascii="Calibri" w:cs="Calibri" w:eastAsia="Calibri" w:hAnsi="Calibri"/>
-                <w:b w:val="false"/>
-                <w:bCs w:val="false"/>
-                <w:i w:val="false"/>
-                <w:iCs w:val="false"/>
-                <w:color w:val="000000"/>
-                <w:sz w:val="19"/>
-                <w:szCs w:val="19"/>
-              </w:rPr>
-              <w:t xml:space="preserve"/>
-            </w:r>
-          </w:p>
-        </w:tc>
-        <w:tc>
-          <w:tcPr>
-            <w:tcW w:type="dxa" w:w="3400"/>
-            <w:tcBorders>
-              <w:top w:val="single" w:color="BFBFBF" w:sz="2"/>
-              <w:left w:val="single" w:color="BFBFBF" w:sz="2"/>
-              <w:bottom w:val="single" w:color="BFBFBF" w:sz="2"/>
-              <w:right w:val="single" w:color="BFBFBF" w:sz="2"/>
-            </w:tcBorders>
-            <w:tcMar>
-              <w:top w:type="dxa" w:w="60"/>
-              <w:left w:type="dxa" w:w="100"/>
-              <w:bottom w:type="dxa" w:w="60"/>
-              <w:right w:type="dxa" w:w="100"/>
-            </w:tcMar>
-          </w:tcPr>
-          <w:p>
-            <w:r>
-              <w:rPr>
-                <w:rFonts w:ascii="Calibri" w:cs="Calibri" w:eastAsia="Calibri" w:hAnsi="Calibri"/>
-                <w:b w:val="false"/>
-                <w:bCs w:val="false"/>
-                <w:i w:val="false"/>
-                <w:iCs w:val="false"/>
-                <w:color w:val="000000"/>
-                <w:sz w:val="19"/>
-                <w:szCs w:val="19"/>
-              </w:rPr>
-              <w:t xml:space="preserve"/>
-            </w:r>
-          </w:p>
-        </w:tc>
-        <w:tc>
-          <w:tcPr>
-            <w:tcW w:type="dxa" w:w="2238"/>
+            <w:tcW w:type="dxa" w:w="3212"/>
+            <w:tcBorders>
+              <w:top w:val="single" w:color="BFBFBF" w:sz="2"/>
+              <w:left w:val="single" w:color="BFBFBF" w:sz="2"/>
+              <w:bottom w:val="single" w:color="BFBFBF" w:sz="2"/>
+              <w:right w:val="single" w:color="BFBFBF" w:sz="2"/>
+            </w:tcBorders>
+            <w:tcMar>
+              <w:top w:type="dxa" w:w="60"/>
+              <w:left w:type="dxa" w:w="100"/>
+              <w:bottom w:type="dxa" w:w="60"/>
+              <w:right w:type="dxa" w:w="100"/>
+            </w:tcMar>
+          </w:tcPr>
+          <w:p>
+            <w:r>
+              <w:rPr>
+                <w:rFonts w:ascii="Calibri" w:cs="Calibri" w:eastAsia="Calibri" w:hAnsi="Calibri"/>
+                <w:b w:val="false"/>
+                <w:bCs w:val="false"/>
+                <w:i w:val="false"/>
+                <w:iCs w:val="false"/>
+                <w:color w:val="000000"/>
+                <w:sz w:val="19"/>
+                <w:szCs w:val="19"/>
+              </w:rPr>
+              <w:t xml:space="preserve"/>
+            </w:r>
+          </w:p>
+        </w:tc>
+        <w:tc>
+          <w:tcPr>
+            <w:tcW w:type="dxa" w:w="3212"/>
+            <w:tcBorders>
+              <w:top w:val="single" w:color="BFBFBF" w:sz="2"/>
+              <w:left w:val="single" w:color="BFBFBF" w:sz="2"/>
+              <w:bottom w:val="single" w:color="BFBFBF" w:sz="2"/>
+              <w:right w:val="single" w:color="BFBFBF" w:sz="2"/>
+            </w:tcBorders>
+            <w:tcMar>
+              <w:top w:type="dxa" w:w="60"/>
+              <w:left w:type="dxa" w:w="100"/>
+              <w:bottom w:type="dxa" w:w="60"/>
+              <w:right w:type="dxa" w:w="100"/>
+            </w:tcMar>
+          </w:tcPr>
+          <w:p>
+            <w:r>
+              <w:rPr>
+                <w:rFonts w:ascii="Calibri" w:cs="Calibri" w:eastAsia="Calibri" w:hAnsi="Calibri"/>
+                <w:b w:val="false"/>
+                <w:bCs w:val="false"/>
+                <w:i w:val="false"/>
+                <w:iCs w:val="false"/>
+                <w:color w:val="000000"/>
+                <w:sz w:val="19"/>
+                <w:szCs w:val="19"/>
+              </w:rPr>
+              <w:t xml:space="preserve"/>
+            </w:r>
+          </w:p>
+        </w:tc>
+        <w:tc>
+          <w:tcPr>
+            <w:tcW w:type="dxa" w:w="3214"/>
             <w:tcBorders>
               <w:top w:val="single" w:color="BFBFBF" w:sz="2"/>
               <w:left w:val="single" w:color="BFBFBF" w:sz="2"/>
@@ -2759,103 +2220,71 @@
       <w:tr>
         <w:tc>
           <w:tcPr>
-            <w:tcW w:type="dxa" w:w="1400"/>
-            <w:tcBorders>
-              <w:top w:val="single" w:color="BFBFBF" w:sz="2"/>
-              <w:left w:val="single" w:color="BFBFBF" w:sz="2"/>
-              <w:bottom w:val="single" w:color="BFBFBF" w:sz="2"/>
-              <w:right w:val="single" w:color="BFBFBF" w:sz="2"/>
-            </w:tcBorders>
-            <w:tcMar>
-              <w:top w:type="dxa" w:w="60"/>
-              <w:left w:type="dxa" w:w="100"/>
-              <w:bottom w:type="dxa" w:w="60"/>
-              <w:right w:type="dxa" w:w="100"/>
-            </w:tcMar>
-          </w:tcPr>
-          <w:p>
-            <w:r>
-              <w:rPr>
-                <w:rFonts w:ascii="Calibri" w:cs="Calibri" w:eastAsia="Calibri" w:hAnsi="Calibri"/>
-                <w:b w:val="false"/>
-                <w:bCs w:val="false"/>
-                <w:i w:val="false"/>
-                <w:iCs w:val="false"/>
-                <w:color w:val="000000"/>
-                <w:sz w:val="19"/>
-                <w:szCs w:val="19"/>
-              </w:rPr>
-              <w:t xml:space="preserve"/>
-            </w:r>
-          </w:p>
-        </w:tc>
-        <w:tc>
-          <w:tcPr>
-            <w:tcW w:type="dxa" w:w="2600"/>
-            <w:tcBorders>
-              <w:top w:val="single" w:color="BFBFBF" w:sz="2"/>
-              <w:left w:val="single" w:color="BFBFBF" w:sz="2"/>
-              <w:bottom w:val="single" w:color="BFBFBF" w:sz="2"/>
-              <w:right w:val="single" w:color="BFBFBF" w:sz="2"/>
-            </w:tcBorders>
-            <w:tcMar>
-              <w:top w:type="dxa" w:w="60"/>
-              <w:left w:type="dxa" w:w="100"/>
-              <w:bottom w:type="dxa" w:w="60"/>
-              <w:right w:type="dxa" w:w="100"/>
-            </w:tcMar>
-          </w:tcPr>
-          <w:p>
-            <w:r>
-              <w:rPr>
-                <w:rFonts w:ascii="Calibri" w:cs="Calibri" w:eastAsia="Calibri" w:hAnsi="Calibri"/>
-                <w:b w:val="false"/>
-                <w:bCs w:val="false"/>
-                <w:i w:val="false"/>
-                <w:iCs w:val="false"/>
-                <w:color w:val="000000"/>
-                <w:sz w:val="19"/>
-                <w:szCs w:val="19"/>
-              </w:rPr>
-              <w:t xml:space="preserve"/>
-            </w:r>
-          </w:p>
-        </w:tc>
-        <w:tc>
-          <w:tcPr>
-            <w:tcW w:type="dxa" w:w="3400"/>
-            <w:tcBorders>
-              <w:top w:val="single" w:color="BFBFBF" w:sz="2"/>
-              <w:left w:val="single" w:color="BFBFBF" w:sz="2"/>
-              <w:bottom w:val="single" w:color="BFBFBF" w:sz="2"/>
-              <w:right w:val="single" w:color="BFBFBF" w:sz="2"/>
-            </w:tcBorders>
-            <w:tcMar>
-              <w:top w:type="dxa" w:w="60"/>
-              <w:left w:type="dxa" w:w="100"/>
-              <w:bottom w:type="dxa" w:w="60"/>
-              <w:right w:type="dxa" w:w="100"/>
-            </w:tcMar>
-          </w:tcPr>
-          <w:p>
-            <w:r>
-              <w:rPr>
-                <w:rFonts w:ascii="Calibri" w:cs="Calibri" w:eastAsia="Calibri" w:hAnsi="Calibri"/>
-                <w:b w:val="false"/>
-                <w:bCs w:val="false"/>
-                <w:i w:val="false"/>
-                <w:iCs w:val="false"/>
-                <w:color w:val="000000"/>
-                <w:sz w:val="19"/>
-                <w:szCs w:val="19"/>
-              </w:rPr>
-              <w:t xml:space="preserve"/>
-            </w:r>
-          </w:p>
-        </w:tc>
-        <w:tc>
-          <w:tcPr>
-            <w:tcW w:type="dxa" w:w="2238"/>
+            <w:tcW w:type="dxa" w:w="3212"/>
+            <w:tcBorders>
+              <w:top w:val="single" w:color="BFBFBF" w:sz="2"/>
+              <w:left w:val="single" w:color="BFBFBF" w:sz="2"/>
+              <w:bottom w:val="single" w:color="BFBFBF" w:sz="2"/>
+              <w:right w:val="single" w:color="BFBFBF" w:sz="2"/>
+            </w:tcBorders>
+            <w:tcMar>
+              <w:top w:type="dxa" w:w="60"/>
+              <w:left w:type="dxa" w:w="100"/>
+              <w:bottom w:type="dxa" w:w="60"/>
+              <w:right w:type="dxa" w:w="100"/>
+            </w:tcMar>
+          </w:tcPr>
+          <w:p>
+            <w:r>
+              <w:rPr>
+                <w:rFonts w:ascii="Calibri" w:cs="Calibri" w:eastAsia="Calibri" w:hAnsi="Calibri"/>
+                <w:b w:val="false"/>
+                <w:bCs w:val="false"/>
+                <w:i w:val="false"/>
+                <w:iCs w:val="false"/>
+                <w:color w:val="000000"/>
+                <w:sz w:val="19"/>
+                <w:szCs w:val="19"/>
+              </w:rPr>
+              <w:t xml:space="preserve"/>
+            </w:r>
+          </w:p>
+        </w:tc>
+        <w:tc>
+          <w:tcPr>
+            <w:tcW w:type="dxa" w:w="3212"/>
+            <w:tcBorders>
+              <w:top w:val="single" w:color="BFBFBF" w:sz="2"/>
+              <w:left w:val="single" w:color="BFBFBF" w:sz="2"/>
+              <w:bottom w:val="single" w:color="BFBFBF" w:sz="2"/>
+              <w:right w:val="single" w:color="BFBFBF" w:sz="2"/>
+            </w:tcBorders>
+            <w:tcMar>
+              <w:top w:type="dxa" w:w="60"/>
+              <w:left w:type="dxa" w:w="100"/>
+              <w:bottom w:type="dxa" w:w="60"/>
+              <w:right w:type="dxa" w:w="100"/>
+            </w:tcMar>
+          </w:tcPr>
+          <w:p>
+            <w:r>
+              <w:rPr>
+                <w:rFonts w:ascii="Calibri" w:cs="Calibri" w:eastAsia="Calibri" w:hAnsi="Calibri"/>
+                <w:b w:val="false"/>
+                <w:bCs w:val="false"/>
+                <w:i w:val="false"/>
+                <w:iCs w:val="false"/>
+                <w:color w:val="000000"/>
+                <w:sz w:val="19"/>
+                <w:szCs w:val="19"/>
+              </w:rPr>
+              <w:t xml:space="preserve"/>
+            </w:r>
+          </w:p>
+        </w:tc>
+        <w:tc>
+          <w:tcPr>
+            <w:tcW w:type="dxa" w:w="3214"/>
             <w:tcBorders>
               <w:top w:val="single" w:color="BFBFBF" w:sz="2"/>
               <w:left w:val="single" w:color="BFBFBF" w:sz="2"/>
@@ -2889,103 +2318,71 @@
       <w:tr>
         <w:tc>
           <w:tcPr>
-            <w:tcW w:type="dxa" w:w="1400"/>
-            <w:tcBorders>
-              <w:top w:val="single" w:color="BFBFBF" w:sz="2"/>
-              <w:left w:val="single" w:color="BFBFBF" w:sz="2"/>
-              <w:bottom w:val="single" w:color="BFBFBF" w:sz="2"/>
-              <w:right w:val="single" w:color="BFBFBF" w:sz="2"/>
-            </w:tcBorders>
-            <w:tcMar>
-              <w:top w:type="dxa" w:w="60"/>
-              <w:left w:type="dxa" w:w="100"/>
-              <w:bottom w:type="dxa" w:w="60"/>
-              <w:right w:type="dxa" w:w="100"/>
-            </w:tcMar>
-          </w:tcPr>
-          <w:p>
-            <w:r>
-              <w:rPr>
-                <w:rFonts w:ascii="Calibri" w:cs="Calibri" w:eastAsia="Calibri" w:hAnsi="Calibri"/>
-                <w:b w:val="false"/>
-                <w:bCs w:val="false"/>
-                <w:i w:val="false"/>
-                <w:iCs w:val="false"/>
-                <w:color w:val="000000"/>
-                <w:sz w:val="19"/>
-                <w:szCs w:val="19"/>
-              </w:rPr>
-              <w:t xml:space="preserve"/>
-            </w:r>
-          </w:p>
-        </w:tc>
-        <w:tc>
-          <w:tcPr>
-            <w:tcW w:type="dxa" w:w="2600"/>
-            <w:tcBorders>
-              <w:top w:val="single" w:color="BFBFBF" w:sz="2"/>
-              <w:left w:val="single" w:color="BFBFBF" w:sz="2"/>
-              <w:bottom w:val="single" w:color="BFBFBF" w:sz="2"/>
-              <w:right w:val="single" w:color="BFBFBF" w:sz="2"/>
-            </w:tcBorders>
-            <w:tcMar>
-              <w:top w:type="dxa" w:w="60"/>
-              <w:left w:type="dxa" w:w="100"/>
-              <w:bottom w:type="dxa" w:w="60"/>
-              <w:right w:type="dxa" w:w="100"/>
-            </w:tcMar>
-          </w:tcPr>
-          <w:p>
-            <w:r>
-              <w:rPr>
-                <w:rFonts w:ascii="Calibri" w:cs="Calibri" w:eastAsia="Calibri" w:hAnsi="Calibri"/>
-                <w:b w:val="false"/>
-                <w:bCs w:val="false"/>
-                <w:i w:val="false"/>
-                <w:iCs w:val="false"/>
-                <w:color w:val="000000"/>
-                <w:sz w:val="19"/>
-                <w:szCs w:val="19"/>
-              </w:rPr>
-              <w:t xml:space="preserve"/>
-            </w:r>
-          </w:p>
-        </w:tc>
-        <w:tc>
-          <w:tcPr>
-            <w:tcW w:type="dxa" w:w="3400"/>
-            <w:tcBorders>
-              <w:top w:val="single" w:color="BFBFBF" w:sz="2"/>
-              <w:left w:val="single" w:color="BFBFBF" w:sz="2"/>
-              <w:bottom w:val="single" w:color="BFBFBF" w:sz="2"/>
-              <w:right w:val="single" w:color="BFBFBF" w:sz="2"/>
-            </w:tcBorders>
-            <w:tcMar>
-              <w:top w:type="dxa" w:w="60"/>
-              <w:left w:type="dxa" w:w="100"/>
-              <w:bottom w:type="dxa" w:w="60"/>
-              <w:right w:type="dxa" w:w="100"/>
-            </w:tcMar>
-          </w:tcPr>
-          <w:p>
-            <w:r>
-              <w:rPr>
-                <w:rFonts w:ascii="Calibri" w:cs="Calibri" w:eastAsia="Calibri" w:hAnsi="Calibri"/>
-                <w:b w:val="false"/>
-                <w:bCs w:val="false"/>
-                <w:i w:val="false"/>
-                <w:iCs w:val="false"/>
-                <w:color w:val="000000"/>
-                <w:sz w:val="19"/>
-                <w:szCs w:val="19"/>
-              </w:rPr>
-              <w:t xml:space="preserve"/>
-            </w:r>
-          </w:p>
-        </w:tc>
-        <w:tc>
-          <w:tcPr>
-            <w:tcW w:type="dxa" w:w="2238"/>
+            <w:tcW w:type="dxa" w:w="3212"/>
+            <w:tcBorders>
+              <w:top w:val="single" w:color="BFBFBF" w:sz="2"/>
+              <w:left w:val="single" w:color="BFBFBF" w:sz="2"/>
+              <w:bottom w:val="single" w:color="BFBFBF" w:sz="2"/>
+              <w:right w:val="single" w:color="BFBFBF" w:sz="2"/>
+            </w:tcBorders>
+            <w:tcMar>
+              <w:top w:type="dxa" w:w="60"/>
+              <w:left w:type="dxa" w:w="100"/>
+              <w:bottom w:type="dxa" w:w="60"/>
+              <w:right w:type="dxa" w:w="100"/>
+            </w:tcMar>
+          </w:tcPr>
+          <w:p>
+            <w:r>
+              <w:rPr>
+                <w:rFonts w:ascii="Calibri" w:cs="Calibri" w:eastAsia="Calibri" w:hAnsi="Calibri"/>
+                <w:b w:val="false"/>
+                <w:bCs w:val="false"/>
+                <w:i w:val="false"/>
+                <w:iCs w:val="false"/>
+                <w:color w:val="000000"/>
+                <w:sz w:val="19"/>
+                <w:szCs w:val="19"/>
+              </w:rPr>
+              <w:t xml:space="preserve"/>
+            </w:r>
+          </w:p>
+        </w:tc>
+        <w:tc>
+          <w:tcPr>
+            <w:tcW w:type="dxa" w:w="3212"/>
+            <w:tcBorders>
+              <w:top w:val="single" w:color="BFBFBF" w:sz="2"/>
+              <w:left w:val="single" w:color="BFBFBF" w:sz="2"/>
+              <w:bottom w:val="single" w:color="BFBFBF" w:sz="2"/>
+              <w:right w:val="single" w:color="BFBFBF" w:sz="2"/>
+            </w:tcBorders>
+            <w:tcMar>
+              <w:top w:type="dxa" w:w="60"/>
+              <w:left w:type="dxa" w:w="100"/>
+              <w:bottom w:type="dxa" w:w="60"/>
+              <w:right w:type="dxa" w:w="100"/>
+            </w:tcMar>
+          </w:tcPr>
+          <w:p>
+            <w:r>
+              <w:rPr>
+                <w:rFonts w:ascii="Calibri" w:cs="Calibri" w:eastAsia="Calibri" w:hAnsi="Calibri"/>
+                <w:b w:val="false"/>
+                <w:bCs w:val="false"/>
+                <w:i w:val="false"/>
+                <w:iCs w:val="false"/>
+                <w:color w:val="000000"/>
+                <w:sz w:val="19"/>
+                <w:szCs w:val="19"/>
+              </w:rPr>
+              <w:t xml:space="preserve"/>
+            </w:r>
+          </w:p>
+        </w:tc>
+        <w:tc>
+          <w:tcPr>
+            <w:tcW w:type="dxa" w:w="3214"/>
             <w:tcBorders>
               <w:top w:val="single" w:color="BFBFBF" w:sz="2"/>
               <w:left w:val="single" w:color="BFBFBF" w:sz="2"/>
@@ -3019,103 +2416,169 @@
       <w:tr>
         <w:tc>
           <w:tcPr>
-            <w:tcW w:type="dxa" w:w="1400"/>
-            <w:tcBorders>
-              <w:top w:val="single" w:color="BFBFBF" w:sz="2"/>
-              <w:left w:val="single" w:color="BFBFBF" w:sz="2"/>
-              <w:bottom w:val="single" w:color="BFBFBF" w:sz="2"/>
-              <w:right w:val="single" w:color="BFBFBF" w:sz="2"/>
-            </w:tcBorders>
-            <w:tcMar>
-              <w:top w:type="dxa" w:w="60"/>
-              <w:left w:type="dxa" w:w="100"/>
-              <w:bottom w:type="dxa" w:w="60"/>
-              <w:right w:type="dxa" w:w="100"/>
-            </w:tcMar>
-          </w:tcPr>
-          <w:p>
-            <w:r>
-              <w:rPr>
-                <w:rFonts w:ascii="Calibri" w:cs="Calibri" w:eastAsia="Calibri" w:hAnsi="Calibri"/>
-                <w:b w:val="false"/>
-                <w:bCs w:val="false"/>
-                <w:i w:val="false"/>
-                <w:iCs w:val="false"/>
-                <w:color w:val="000000"/>
-                <w:sz w:val="19"/>
-                <w:szCs w:val="19"/>
-              </w:rPr>
-              <w:t xml:space="preserve"/>
-            </w:r>
-          </w:p>
-        </w:tc>
-        <w:tc>
-          <w:tcPr>
-            <w:tcW w:type="dxa" w:w="2600"/>
-            <w:tcBorders>
-              <w:top w:val="single" w:color="BFBFBF" w:sz="2"/>
-              <w:left w:val="single" w:color="BFBFBF" w:sz="2"/>
-              <w:bottom w:val="single" w:color="BFBFBF" w:sz="2"/>
-              <w:right w:val="single" w:color="BFBFBF" w:sz="2"/>
-            </w:tcBorders>
-            <w:tcMar>
-              <w:top w:type="dxa" w:w="60"/>
-              <w:left w:type="dxa" w:w="100"/>
-              <w:bottom w:type="dxa" w:w="60"/>
-              <w:right w:type="dxa" w:w="100"/>
-            </w:tcMar>
-          </w:tcPr>
-          <w:p>
-            <w:r>
-              <w:rPr>
-                <w:rFonts w:ascii="Calibri" w:cs="Calibri" w:eastAsia="Calibri" w:hAnsi="Calibri"/>
-                <w:b w:val="false"/>
-                <w:bCs w:val="false"/>
-                <w:i w:val="false"/>
-                <w:iCs w:val="false"/>
-                <w:color w:val="000000"/>
-                <w:sz w:val="19"/>
-                <w:szCs w:val="19"/>
-              </w:rPr>
-              <w:t xml:space="preserve"/>
-            </w:r>
-          </w:p>
-        </w:tc>
-        <w:tc>
-          <w:tcPr>
-            <w:tcW w:type="dxa" w:w="3400"/>
-            <w:tcBorders>
-              <w:top w:val="single" w:color="BFBFBF" w:sz="2"/>
-              <w:left w:val="single" w:color="BFBFBF" w:sz="2"/>
-              <w:bottom w:val="single" w:color="BFBFBF" w:sz="2"/>
-              <w:right w:val="single" w:color="BFBFBF" w:sz="2"/>
-            </w:tcBorders>
-            <w:tcMar>
-              <w:top w:type="dxa" w:w="60"/>
-              <w:left w:type="dxa" w:w="100"/>
-              <w:bottom w:type="dxa" w:w="60"/>
-              <w:right w:type="dxa" w:w="100"/>
-            </w:tcMar>
-          </w:tcPr>
-          <w:p>
-            <w:r>
-              <w:rPr>
-                <w:rFonts w:ascii="Calibri" w:cs="Calibri" w:eastAsia="Calibri" w:hAnsi="Calibri"/>
-                <w:b w:val="false"/>
-                <w:bCs w:val="false"/>
-                <w:i w:val="false"/>
-                <w:iCs w:val="false"/>
-                <w:color w:val="000000"/>
-                <w:sz w:val="19"/>
-                <w:szCs w:val="19"/>
-              </w:rPr>
-              <w:t xml:space="preserve"/>
-            </w:r>
-          </w:p>
-        </w:tc>
-        <w:tc>
-          <w:tcPr>
-            <w:tcW w:type="dxa" w:w="2238"/>
+            <w:tcW w:type="dxa" w:w="3212"/>
+            <w:tcBorders>
+              <w:top w:val="single" w:color="BFBFBF" w:sz="2"/>
+              <w:left w:val="single" w:color="BFBFBF" w:sz="2"/>
+              <w:bottom w:val="single" w:color="BFBFBF" w:sz="2"/>
+              <w:right w:val="single" w:color="BFBFBF" w:sz="2"/>
+            </w:tcBorders>
+            <w:tcMar>
+              <w:top w:type="dxa" w:w="60"/>
+              <w:left w:type="dxa" w:w="100"/>
+              <w:bottom w:type="dxa" w:w="60"/>
+              <w:right w:type="dxa" w:w="100"/>
+            </w:tcMar>
+          </w:tcPr>
+          <w:p>
+            <w:r>
+              <w:rPr>
+                <w:rFonts w:ascii="Calibri" w:cs="Calibri" w:eastAsia="Calibri" w:hAnsi="Calibri"/>
+                <w:b w:val="false"/>
+                <w:bCs w:val="false"/>
+                <w:i w:val="false"/>
+                <w:iCs w:val="false"/>
+                <w:color w:val="000000"/>
+                <w:sz w:val="19"/>
+                <w:szCs w:val="19"/>
+              </w:rPr>
+              <w:t xml:space="preserve"/>
+            </w:r>
+          </w:p>
+        </w:tc>
+        <w:tc>
+          <w:tcPr>
+            <w:tcW w:type="dxa" w:w="3212"/>
+            <w:tcBorders>
+              <w:top w:val="single" w:color="BFBFBF" w:sz="2"/>
+              <w:left w:val="single" w:color="BFBFBF" w:sz="2"/>
+              <w:bottom w:val="single" w:color="BFBFBF" w:sz="2"/>
+              <w:right w:val="single" w:color="BFBFBF" w:sz="2"/>
+            </w:tcBorders>
+            <w:tcMar>
+              <w:top w:type="dxa" w:w="60"/>
+              <w:left w:type="dxa" w:w="100"/>
+              <w:bottom w:type="dxa" w:w="60"/>
+              <w:right w:type="dxa" w:w="100"/>
+            </w:tcMar>
+          </w:tcPr>
+          <w:p>
+            <w:r>
+              <w:rPr>
+                <w:rFonts w:ascii="Calibri" w:cs="Calibri" w:eastAsia="Calibri" w:hAnsi="Calibri"/>
+                <w:b w:val="false"/>
+                <w:bCs w:val="false"/>
+                <w:i w:val="false"/>
+                <w:iCs w:val="false"/>
+                <w:color w:val="000000"/>
+                <w:sz w:val="19"/>
+                <w:szCs w:val="19"/>
+              </w:rPr>
+              <w:t xml:space="preserve"/>
+            </w:r>
+          </w:p>
+        </w:tc>
+        <w:tc>
+          <w:tcPr>
+            <w:tcW w:type="dxa" w:w="3214"/>
+            <w:tcBorders>
+              <w:top w:val="single" w:color="BFBFBF" w:sz="2"/>
+              <w:left w:val="single" w:color="BFBFBF" w:sz="2"/>
+              <w:bottom w:val="single" w:color="BFBFBF" w:sz="2"/>
+              <w:right w:val="single" w:color="BFBFBF" w:sz="2"/>
+            </w:tcBorders>
+            <w:tcMar>
+              <w:top w:type="dxa" w:w="60"/>
+              <w:left w:type="dxa" w:w="100"/>
+              <w:bottom w:type="dxa" w:w="60"/>
+              <w:right w:type="dxa" w:w="100"/>
+            </w:tcMar>
+          </w:tcPr>
+          <w:p>
+            <w:r>
+              <w:rPr>
+                <w:rFonts w:ascii="Calibri" w:cs="Calibri" w:eastAsia="Calibri" w:hAnsi="Calibri"/>
+                <w:b w:val="false"/>
+                <w:bCs w:val="false"/>
+                <w:i w:val="false"/>
+                <w:iCs w:val="false"/>
+                <w:color w:val="000000"/>
+                <w:sz w:val="19"/>
+                <w:szCs w:val="19"/>
+              </w:rPr>
+              <w:t xml:space="preserve"/>
+            </w:r>
+          </w:p>
+        </w:tc>
+      </w:tr>
+      <w:tr>
+        <w:tc>
+          <w:tcPr>
+            <w:tcW w:type="dxa" w:w="3212"/>
+            <w:tcBorders>
+              <w:top w:val="single" w:color="BFBFBF" w:sz="2"/>
+              <w:left w:val="single" w:color="BFBFBF" w:sz="2"/>
+              <w:bottom w:val="single" w:color="BFBFBF" w:sz="2"/>
+              <w:right w:val="single" w:color="BFBFBF" w:sz="2"/>
+            </w:tcBorders>
+            <w:tcMar>
+              <w:top w:type="dxa" w:w="60"/>
+              <w:left w:type="dxa" w:w="100"/>
+              <w:bottom w:type="dxa" w:w="60"/>
+              <w:right w:type="dxa" w:w="100"/>
+            </w:tcMar>
+          </w:tcPr>
+          <w:p>
+            <w:r>
+              <w:rPr>
+                <w:rFonts w:ascii="Calibri" w:cs="Calibri" w:eastAsia="Calibri" w:hAnsi="Calibri"/>
+                <w:b w:val="false"/>
+                <w:bCs w:val="false"/>
+                <w:i w:val="false"/>
+                <w:iCs w:val="false"/>
+                <w:color w:val="000000"/>
+                <w:sz w:val="19"/>
+                <w:szCs w:val="19"/>
+              </w:rPr>
+              <w:t xml:space="preserve"/>
+            </w:r>
+          </w:p>
+        </w:tc>
+        <w:tc>
+          <w:tcPr>
+            <w:tcW w:type="dxa" w:w="3212"/>
+            <w:tcBorders>
+              <w:top w:val="single" w:color="BFBFBF" w:sz="2"/>
+              <w:left w:val="single" w:color="BFBFBF" w:sz="2"/>
+              <w:bottom w:val="single" w:color="BFBFBF" w:sz="2"/>
+              <w:right w:val="single" w:color="BFBFBF" w:sz="2"/>
+            </w:tcBorders>
+            <w:tcMar>
+              <w:top w:type="dxa" w:w="60"/>
+              <w:left w:type="dxa" w:w="100"/>
+              <w:bottom w:type="dxa" w:w="60"/>
+              <w:right w:type="dxa" w:w="100"/>
+            </w:tcMar>
+          </w:tcPr>
+          <w:p>
+            <w:r>
+              <w:rPr>
+                <w:rFonts w:ascii="Calibri" w:cs="Calibri" w:eastAsia="Calibri" w:hAnsi="Calibri"/>
+                <w:b w:val="false"/>
+                <w:bCs w:val="false"/>
+                <w:i w:val="false"/>
+                <w:iCs w:val="false"/>
+                <w:color w:val="000000"/>
+                <w:sz w:val="19"/>
+                <w:szCs w:val="19"/>
+              </w:rPr>
+              <w:t xml:space="preserve"/>
+            </w:r>
+          </w:p>
+        </w:tc>
+        <w:tc>
+          <w:tcPr>
+            <w:tcW w:type="dxa" w:w="3214"/>
             <w:tcBorders>
               <w:top w:val="single" w:color="BFBFBF" w:sz="2"/>
               <w:left w:val="single" w:color="BFBFBF" w:sz="2"/>
@@ -3285,536 +2748,6 @@
         <w:t xml:space="preserve">[ … ]</w:t>
       </w:r>
     </w:p>
-    <w:p>
-      <w:pPr>
-        <w:spacing w:after="60"/>
-      </w:pPr>
-      <w:r>
-        <w:rPr>
-          <w:rFonts w:ascii="Calibri" w:cs="Calibri" w:eastAsia="Calibri" w:hAnsi="Calibri"/>
-          <w:i/>
-          <w:iCs/>
-          <w:color w:val="767676"/>
-          <w:sz w:val="17"/>
-          <w:szCs w:val="17"/>
-        </w:rPr>
-        <w:t xml:space="preserve">Maak expliciet welke normen of eisen al door de gebaande weg zijn afgedekt. Wie on-road bouwt, hoeft die niet opnieuw aan te tonen — wat in de laatste kolom staat, blijft wel zijn eigen werk.</w:t>
-      </w:r>
-    </w:p>
-    <w:tbl>
-      <w:tblPr>
-        <w:tblW w:type="dxa" w:w="9638"/>
-        <w:tblBorders>
-          <w:top w:val="single" w:color="auto" w:sz="4"/>
-          <w:left w:val="single" w:color="auto" w:sz="4"/>
-          <w:bottom w:val="single" w:color="auto" w:sz="4"/>
-          <w:right w:val="single" w:color="auto" w:sz="4"/>
-          <w:insideH w:val="single" w:color="auto" w:sz="4"/>
-          <w:insideV w:val="single" w:color="auto" w:sz="4"/>
-        </w:tblBorders>
-      </w:tblPr>
-      <w:tblGrid>
-        <w:gridCol w:w="3000"/>
-        <w:gridCol w:w="3300"/>
-        <w:gridCol w:w="3338"/>
-      </w:tblGrid>
-      <w:tr>
-        <w:trPr>
-          <w:tblHeader/>
-        </w:trPr>
-        <w:tc>
-          <w:tcPr>
-            <w:tcW w:type="dxa" w:w="3000"/>
-            <w:tcBorders>
-              <w:top w:val="single" w:color="BFBFBF" w:sz="2"/>
-              <w:left w:val="single" w:color="BFBFBF" w:sz="2"/>
-              <w:bottom w:val="single" w:color="BFBFBF" w:sz="2"/>
-              <w:right w:val="single" w:color="BFBFBF" w:sz="2"/>
-            </w:tcBorders>
-            <w:shd w:fill="EFF2F7" w:color="auto" w:val="clear"/>
-            <w:tcMar>
-              <w:top w:type="dxa" w:w="60"/>
-              <w:left w:type="dxa" w:w="100"/>
-              <w:bottom w:type="dxa" w:w="60"/>
-              <w:right w:type="dxa" w:w="100"/>
-            </w:tcMar>
-          </w:tcPr>
-          <w:p>
-            <w:r>
-              <w:rPr>
-                <w:rFonts w:ascii="Calibri" w:cs="Calibri" w:eastAsia="Calibri" w:hAnsi="Calibri"/>
-                <w:b/>
-                <w:bCs/>
-                <w:i w:val="false"/>
-                <w:iCs w:val="false"/>
-                <w:color w:val="1F3864"/>
-                <w:sz w:val="19"/>
-                <w:szCs w:val="19"/>
-              </w:rPr>
-              <w:t xml:space="preserve">Norm of eis</w:t>
-            </w:r>
-          </w:p>
-        </w:tc>
-        <w:tc>
-          <w:tcPr>
-            <w:tcW w:type="dxa" w:w="3300"/>
-            <w:tcBorders>
-              <w:top w:val="single" w:color="BFBFBF" w:sz="2"/>
-              <w:left w:val="single" w:color="BFBFBF" w:sz="2"/>
-              <w:bottom w:val="single" w:color="BFBFBF" w:sz="2"/>
-              <w:right w:val="single" w:color="BFBFBF" w:sz="2"/>
-            </w:tcBorders>
-            <w:shd w:fill="EFF2F7" w:color="auto" w:val="clear"/>
-            <w:tcMar>
-              <w:top w:type="dxa" w:w="60"/>
-              <w:left w:type="dxa" w:w="100"/>
-              <w:bottom w:type="dxa" w:w="60"/>
-              <w:right w:type="dxa" w:w="100"/>
-            </w:tcMar>
-          </w:tcPr>
-          <w:p>
-            <w:r>
-              <w:rPr>
-                <w:rFonts w:ascii="Calibri" w:cs="Calibri" w:eastAsia="Calibri" w:hAnsi="Calibri"/>
-                <w:b/>
-                <w:bCs/>
-                <w:i w:val="false"/>
-                <w:iCs w:val="false"/>
-                <w:color w:val="1F3864"/>
-                <w:sz w:val="19"/>
-                <w:szCs w:val="19"/>
-              </w:rPr>
-              <w:t xml:space="preserve">Afgedekt door</w:t>
-            </w:r>
-          </w:p>
-        </w:tc>
-        <w:tc>
-          <w:tcPr>
-            <w:tcW w:type="dxa" w:w="3338"/>
-            <w:tcBorders>
-              <w:top w:val="single" w:color="BFBFBF" w:sz="2"/>
-              <w:left w:val="single" w:color="BFBFBF" w:sz="2"/>
-              <w:bottom w:val="single" w:color="BFBFBF" w:sz="2"/>
-              <w:right w:val="single" w:color="BFBFBF" w:sz="2"/>
-            </w:tcBorders>
-            <w:shd w:fill="EFF2F7" w:color="auto" w:val="clear"/>
-            <w:tcMar>
-              <w:top w:type="dxa" w:w="60"/>
-              <w:left w:type="dxa" w:w="100"/>
-              <w:bottom w:type="dxa" w:w="60"/>
-              <w:right w:type="dxa" w:w="100"/>
-            </w:tcMar>
-          </w:tcPr>
-          <w:p>
-            <w:r>
-              <w:rPr>
-                <w:rFonts w:ascii="Calibri" w:cs="Calibri" w:eastAsia="Calibri" w:hAnsi="Calibri"/>
-                <w:b/>
-                <w:bCs/>
-                <w:i w:val="false"/>
-                <w:iCs w:val="false"/>
-                <w:color w:val="1F3864"/>
-                <w:sz w:val="19"/>
-                <w:szCs w:val="19"/>
-              </w:rPr>
-              <w:t xml:space="preserve">Wat je zelf nog aantoont</w:t>
-            </w:r>
-          </w:p>
-        </w:tc>
-      </w:tr>
-      <w:tr>
-        <w:tc>
-          <w:tcPr>
-            <w:tcW w:type="dxa" w:w="3000"/>
-            <w:tcBorders>
-              <w:top w:val="single" w:color="BFBFBF" w:sz="2"/>
-              <w:left w:val="single" w:color="BFBFBF" w:sz="2"/>
-              <w:bottom w:val="single" w:color="BFBFBF" w:sz="2"/>
-              <w:right w:val="single" w:color="BFBFBF" w:sz="2"/>
-            </w:tcBorders>
-            <w:tcMar>
-              <w:top w:type="dxa" w:w="60"/>
-              <w:left w:type="dxa" w:w="100"/>
-              <w:bottom w:type="dxa" w:w="60"/>
-              <w:right w:type="dxa" w:w="100"/>
-            </w:tcMar>
-          </w:tcPr>
-          <w:p>
-            <w:r>
-              <w:rPr>
-                <w:rFonts w:ascii="Calibri" w:cs="Calibri" w:eastAsia="Calibri" w:hAnsi="Calibri"/>
-                <w:b w:val="false"/>
-                <w:bCs w:val="false"/>
-                <w:i w:val="false"/>
-                <w:iCs w:val="false"/>
-                <w:color w:val="000000"/>
-                <w:sz w:val="19"/>
-                <w:szCs w:val="19"/>
-              </w:rPr>
-              <w:t xml:space="preserve"/>
-            </w:r>
-          </w:p>
-        </w:tc>
-        <w:tc>
-          <w:tcPr>
-            <w:tcW w:type="dxa" w:w="3300"/>
-            <w:tcBorders>
-              <w:top w:val="single" w:color="BFBFBF" w:sz="2"/>
-              <w:left w:val="single" w:color="BFBFBF" w:sz="2"/>
-              <w:bottom w:val="single" w:color="BFBFBF" w:sz="2"/>
-              <w:right w:val="single" w:color="BFBFBF" w:sz="2"/>
-            </w:tcBorders>
-            <w:tcMar>
-              <w:top w:type="dxa" w:w="60"/>
-              <w:left w:type="dxa" w:w="100"/>
-              <w:bottom w:type="dxa" w:w="60"/>
-              <w:right w:type="dxa" w:w="100"/>
-            </w:tcMar>
-          </w:tcPr>
-          <w:p>
-            <w:r>
-              <w:rPr>
-                <w:rFonts w:ascii="Calibri" w:cs="Calibri" w:eastAsia="Calibri" w:hAnsi="Calibri"/>
-                <w:b w:val="false"/>
-                <w:bCs w:val="false"/>
-                <w:i w:val="false"/>
-                <w:iCs w:val="false"/>
-                <w:color w:val="000000"/>
-                <w:sz w:val="19"/>
-                <w:szCs w:val="19"/>
-              </w:rPr>
-              <w:t xml:space="preserve"/>
-            </w:r>
-          </w:p>
-        </w:tc>
-        <w:tc>
-          <w:tcPr>
-            <w:tcW w:type="dxa" w:w="3338"/>
-            <w:tcBorders>
-              <w:top w:val="single" w:color="BFBFBF" w:sz="2"/>
-              <w:left w:val="single" w:color="BFBFBF" w:sz="2"/>
-              <w:bottom w:val="single" w:color="BFBFBF" w:sz="2"/>
-              <w:right w:val="single" w:color="BFBFBF" w:sz="2"/>
-            </w:tcBorders>
-            <w:tcMar>
-              <w:top w:type="dxa" w:w="60"/>
-              <w:left w:type="dxa" w:w="100"/>
-              <w:bottom w:type="dxa" w:w="60"/>
-              <w:right w:type="dxa" w:w="100"/>
-            </w:tcMar>
-          </w:tcPr>
-          <w:p>
-            <w:r>
-              <w:rPr>
-                <w:rFonts w:ascii="Calibri" w:cs="Calibri" w:eastAsia="Calibri" w:hAnsi="Calibri"/>
-                <w:b w:val="false"/>
-                <w:bCs w:val="false"/>
-                <w:i w:val="false"/>
-                <w:iCs w:val="false"/>
-                <w:color w:val="000000"/>
-                <w:sz w:val="19"/>
-                <w:szCs w:val="19"/>
-              </w:rPr>
-              <w:t xml:space="preserve"/>
-            </w:r>
-          </w:p>
-        </w:tc>
-      </w:tr>
-      <w:tr>
-        <w:tc>
-          <w:tcPr>
-            <w:tcW w:type="dxa" w:w="3000"/>
-            <w:tcBorders>
-              <w:top w:val="single" w:color="BFBFBF" w:sz="2"/>
-              <w:left w:val="single" w:color="BFBFBF" w:sz="2"/>
-              <w:bottom w:val="single" w:color="BFBFBF" w:sz="2"/>
-              <w:right w:val="single" w:color="BFBFBF" w:sz="2"/>
-            </w:tcBorders>
-            <w:tcMar>
-              <w:top w:type="dxa" w:w="60"/>
-              <w:left w:type="dxa" w:w="100"/>
-              <w:bottom w:type="dxa" w:w="60"/>
-              <w:right w:type="dxa" w:w="100"/>
-            </w:tcMar>
-          </w:tcPr>
-          <w:p>
-            <w:r>
-              <w:rPr>
-                <w:rFonts w:ascii="Calibri" w:cs="Calibri" w:eastAsia="Calibri" w:hAnsi="Calibri"/>
-                <w:b w:val="false"/>
-                <w:bCs w:val="false"/>
-                <w:i w:val="false"/>
-                <w:iCs w:val="false"/>
-                <w:color w:val="000000"/>
-                <w:sz w:val="19"/>
-                <w:szCs w:val="19"/>
-              </w:rPr>
-              <w:t xml:space="preserve"/>
-            </w:r>
-          </w:p>
-        </w:tc>
-        <w:tc>
-          <w:tcPr>
-            <w:tcW w:type="dxa" w:w="3300"/>
-            <w:tcBorders>
-              <w:top w:val="single" w:color="BFBFBF" w:sz="2"/>
-              <w:left w:val="single" w:color="BFBFBF" w:sz="2"/>
-              <w:bottom w:val="single" w:color="BFBFBF" w:sz="2"/>
-              <w:right w:val="single" w:color="BFBFBF" w:sz="2"/>
-            </w:tcBorders>
-            <w:tcMar>
-              <w:top w:type="dxa" w:w="60"/>
-              <w:left w:type="dxa" w:w="100"/>
-              <w:bottom w:type="dxa" w:w="60"/>
-              <w:right w:type="dxa" w:w="100"/>
-            </w:tcMar>
-          </w:tcPr>
-          <w:p>
-            <w:r>
-              <w:rPr>
-                <w:rFonts w:ascii="Calibri" w:cs="Calibri" w:eastAsia="Calibri" w:hAnsi="Calibri"/>
-                <w:b w:val="false"/>
-                <w:bCs w:val="false"/>
-                <w:i w:val="false"/>
-                <w:iCs w:val="false"/>
-                <w:color w:val="000000"/>
-                <w:sz w:val="19"/>
-                <w:szCs w:val="19"/>
-              </w:rPr>
-              <w:t xml:space="preserve"/>
-            </w:r>
-          </w:p>
-        </w:tc>
-        <w:tc>
-          <w:tcPr>
-            <w:tcW w:type="dxa" w:w="3338"/>
-            <w:tcBorders>
-              <w:top w:val="single" w:color="BFBFBF" w:sz="2"/>
-              <w:left w:val="single" w:color="BFBFBF" w:sz="2"/>
-              <w:bottom w:val="single" w:color="BFBFBF" w:sz="2"/>
-              <w:right w:val="single" w:color="BFBFBF" w:sz="2"/>
-            </w:tcBorders>
-            <w:tcMar>
-              <w:top w:type="dxa" w:w="60"/>
-              <w:left w:type="dxa" w:w="100"/>
-              <w:bottom w:type="dxa" w:w="60"/>
-              <w:right w:type="dxa" w:w="100"/>
-            </w:tcMar>
-          </w:tcPr>
-          <w:p>
-            <w:r>
-              <w:rPr>
-                <w:rFonts w:ascii="Calibri" w:cs="Calibri" w:eastAsia="Calibri" w:hAnsi="Calibri"/>
-                <w:b w:val="false"/>
-                <w:bCs w:val="false"/>
-                <w:i w:val="false"/>
-                <w:iCs w:val="false"/>
-                <w:color w:val="000000"/>
-                <w:sz w:val="19"/>
-                <w:szCs w:val="19"/>
-              </w:rPr>
-              <w:t xml:space="preserve"/>
-            </w:r>
-          </w:p>
-        </w:tc>
-      </w:tr>
-      <w:tr>
-        <w:tc>
-          <w:tcPr>
-            <w:tcW w:type="dxa" w:w="3000"/>
-            <w:tcBorders>
-              <w:top w:val="single" w:color="BFBFBF" w:sz="2"/>
-              <w:left w:val="single" w:color="BFBFBF" w:sz="2"/>
-              <w:bottom w:val="single" w:color="BFBFBF" w:sz="2"/>
-              <w:right w:val="single" w:color="BFBFBF" w:sz="2"/>
-            </w:tcBorders>
-            <w:tcMar>
-              <w:top w:type="dxa" w:w="60"/>
-              <w:left w:type="dxa" w:w="100"/>
-              <w:bottom w:type="dxa" w:w="60"/>
-              <w:right w:type="dxa" w:w="100"/>
-            </w:tcMar>
-          </w:tcPr>
-          <w:p>
-            <w:r>
-              <w:rPr>
-                <w:rFonts w:ascii="Calibri" w:cs="Calibri" w:eastAsia="Calibri" w:hAnsi="Calibri"/>
-                <w:b w:val="false"/>
-                <w:bCs w:val="false"/>
-                <w:i w:val="false"/>
-                <w:iCs w:val="false"/>
-                <w:color w:val="000000"/>
-                <w:sz w:val="19"/>
-                <w:szCs w:val="19"/>
-              </w:rPr>
-              <w:t xml:space="preserve"/>
-            </w:r>
-          </w:p>
-        </w:tc>
-        <w:tc>
-          <w:tcPr>
-            <w:tcW w:type="dxa" w:w="3300"/>
-            <w:tcBorders>
-              <w:top w:val="single" w:color="BFBFBF" w:sz="2"/>
-              <w:left w:val="single" w:color="BFBFBF" w:sz="2"/>
-              <w:bottom w:val="single" w:color="BFBFBF" w:sz="2"/>
-              <w:right w:val="single" w:color="BFBFBF" w:sz="2"/>
-            </w:tcBorders>
-            <w:tcMar>
-              <w:top w:type="dxa" w:w="60"/>
-              <w:left w:type="dxa" w:w="100"/>
-              <w:bottom w:type="dxa" w:w="60"/>
-              <w:right w:type="dxa" w:w="100"/>
-            </w:tcMar>
-          </w:tcPr>
-          <w:p>
-            <w:r>
-              <w:rPr>
-                <w:rFonts w:ascii="Calibri" w:cs="Calibri" w:eastAsia="Calibri" w:hAnsi="Calibri"/>
-                <w:b w:val="false"/>
-                <w:bCs w:val="false"/>
-                <w:i w:val="false"/>
-                <w:iCs w:val="false"/>
-                <w:color w:val="000000"/>
-                <w:sz w:val="19"/>
-                <w:szCs w:val="19"/>
-              </w:rPr>
-              <w:t xml:space="preserve"/>
-            </w:r>
-          </w:p>
-        </w:tc>
-        <w:tc>
-          <w:tcPr>
-            <w:tcW w:type="dxa" w:w="3338"/>
-            <w:tcBorders>
-              <w:top w:val="single" w:color="BFBFBF" w:sz="2"/>
-              <w:left w:val="single" w:color="BFBFBF" w:sz="2"/>
-              <w:bottom w:val="single" w:color="BFBFBF" w:sz="2"/>
-              <w:right w:val="single" w:color="BFBFBF" w:sz="2"/>
-            </w:tcBorders>
-            <w:tcMar>
-              <w:top w:type="dxa" w:w="60"/>
-              <w:left w:type="dxa" w:w="100"/>
-              <w:bottom w:type="dxa" w:w="60"/>
-              <w:right w:type="dxa" w:w="100"/>
-            </w:tcMar>
-          </w:tcPr>
-          <w:p>
-            <w:r>
-              <w:rPr>
-                <w:rFonts w:ascii="Calibri" w:cs="Calibri" w:eastAsia="Calibri" w:hAnsi="Calibri"/>
-                <w:b w:val="false"/>
-                <w:bCs w:val="false"/>
-                <w:i w:val="false"/>
-                <w:iCs w:val="false"/>
-                <w:color w:val="000000"/>
-                <w:sz w:val="19"/>
-                <w:szCs w:val="19"/>
-              </w:rPr>
-              <w:t xml:space="preserve"/>
-            </w:r>
-          </w:p>
-        </w:tc>
-      </w:tr>
-      <w:tr>
-        <w:tc>
-          <w:tcPr>
-            <w:tcW w:type="dxa" w:w="3000"/>
-            <w:tcBorders>
-              <w:top w:val="single" w:color="BFBFBF" w:sz="2"/>
-              <w:left w:val="single" w:color="BFBFBF" w:sz="2"/>
-              <w:bottom w:val="single" w:color="BFBFBF" w:sz="2"/>
-              <w:right w:val="single" w:color="BFBFBF" w:sz="2"/>
-            </w:tcBorders>
-            <w:tcMar>
-              <w:top w:type="dxa" w:w="60"/>
-              <w:left w:type="dxa" w:w="100"/>
-              <w:bottom w:type="dxa" w:w="60"/>
-              <w:right w:type="dxa" w:w="100"/>
-            </w:tcMar>
-          </w:tcPr>
-          <w:p>
-            <w:r>
-              <w:rPr>
-                <w:rFonts w:ascii="Calibri" w:cs="Calibri" w:eastAsia="Calibri" w:hAnsi="Calibri"/>
-                <w:b w:val="false"/>
-                <w:bCs w:val="false"/>
-                <w:i w:val="false"/>
-                <w:iCs w:val="false"/>
-                <w:color w:val="000000"/>
-                <w:sz w:val="19"/>
-                <w:szCs w:val="19"/>
-              </w:rPr>
-              <w:t xml:space="preserve"/>
-            </w:r>
-          </w:p>
-        </w:tc>
-        <w:tc>
-          <w:tcPr>
-            <w:tcW w:type="dxa" w:w="3300"/>
-            <w:tcBorders>
-              <w:top w:val="single" w:color="BFBFBF" w:sz="2"/>
-              <w:left w:val="single" w:color="BFBFBF" w:sz="2"/>
-              <w:bottom w:val="single" w:color="BFBFBF" w:sz="2"/>
-              <w:right w:val="single" w:color="BFBFBF" w:sz="2"/>
-            </w:tcBorders>
-            <w:tcMar>
-              <w:top w:type="dxa" w:w="60"/>
-              <w:left w:type="dxa" w:w="100"/>
-              <w:bottom w:type="dxa" w:w="60"/>
-              <w:right w:type="dxa" w:w="100"/>
-            </w:tcMar>
-          </w:tcPr>
-          <w:p>
-            <w:r>
-              <w:rPr>
-                <w:rFonts w:ascii="Calibri" w:cs="Calibri" w:eastAsia="Calibri" w:hAnsi="Calibri"/>
-                <w:b w:val="false"/>
-                <w:bCs w:val="false"/>
-                <w:i w:val="false"/>
-                <w:iCs w:val="false"/>
-                <w:color w:val="000000"/>
-                <w:sz w:val="19"/>
-                <w:szCs w:val="19"/>
-              </w:rPr>
-              <w:t xml:space="preserve"/>
-            </w:r>
-          </w:p>
-        </w:tc>
-        <w:tc>
-          <w:tcPr>
-            <w:tcW w:type="dxa" w:w="3338"/>
-            <w:tcBorders>
-              <w:top w:val="single" w:color="BFBFBF" w:sz="2"/>
-              <w:left w:val="single" w:color="BFBFBF" w:sz="2"/>
-              <w:bottom w:val="single" w:color="BFBFBF" w:sz="2"/>
-              <w:right w:val="single" w:color="BFBFBF" w:sz="2"/>
-            </w:tcBorders>
-            <w:tcMar>
-              <w:top w:type="dxa" w:w="60"/>
-              <w:left w:type="dxa" w:w="100"/>
-              <w:bottom w:type="dxa" w:w="60"/>
-              <w:right w:type="dxa" w:w="100"/>
-            </w:tcMar>
-          </w:tcPr>
-          <w:p>
-            <w:r>
-              <w:rPr>
-                <w:rFonts w:ascii="Calibri" w:cs="Calibri" w:eastAsia="Calibri" w:hAnsi="Calibri"/>
-                <w:b w:val="false"/>
-                <w:bCs w:val="false"/>
-                <w:i w:val="false"/>
-                <w:iCs w:val="false"/>
-                <w:color w:val="000000"/>
-                <w:sz w:val="19"/>
-                <w:szCs w:val="19"/>
-              </w:rPr>
-              <w:t xml:space="preserve"/>
-            </w:r>
-          </w:p>
-        </w:tc>
-      </w:tr>
-    </w:tbl>
     <w:p>
       <w:pPr>
         <w:spacing w:after="20" w:before="260"/>
@@ -3911,6 +2844,42 @@
           <w:szCs w:val="20"/>
         </w:rPr>
         <w:t xml:space="preserve">Bij elk item staan de voorwaarden en beperkingen.</w:t>
+      </w:r>
+    </w:p>
+    <w:p>
+      <w:pPr>
+        <w:pStyle w:val="ListParagraph"/>
+        <w:numPr>
+          <w:ilvl w:val="0"/>
+          <w:numId w:val="2"/>
+        </w:numPr>
+        <w:spacing w:after="20"/>
+      </w:pPr>
+      <w:r>
+        <w:rPr>
+          <w:rFonts w:ascii="Calibri" w:cs="Calibri" w:eastAsia="Calibri" w:hAnsi="Calibri"/>
+          <w:sz w:val="20"/>
+          <w:szCs w:val="20"/>
+        </w:rPr>
+        <w:t xml:space="preserve">Van elk item is bekend waarvoor het níet bedoeld is.</w:t>
+      </w:r>
+    </w:p>
+    <w:p>
+      <w:pPr>
+        <w:pStyle w:val="ListParagraph"/>
+        <w:numPr>
+          <w:ilvl w:val="0"/>
+          <w:numId w:val="2"/>
+        </w:numPr>
+        <w:spacing w:after="20"/>
+      </w:pPr>
+      <w:r>
+        <w:rPr>
+          <w:rFonts w:ascii="Calibri" w:cs="Calibri" w:eastAsia="Calibri" w:hAnsi="Calibri"/>
+          <w:sz w:val="20"/>
+          <w:szCs w:val="20"/>
+        </w:rPr>
+        <w:t xml:space="preserve">Een team kan een item gebruiken zonder eerst te overleggen.</w:t>
       </w:r>
     </w:p>
     <w:p>
@@ -3974,42 +2943,6 @@
       <w:pgNumType/>
       <w:docGrid w:linePitch="360"/>
     </w:sectPr>
-    <w:p>
-      <w:pPr>
-        <w:pStyle w:val="ListParagraph"/>
-        <w:numPr>
-          <w:ilvl w:val="0"/>
-          <w:numId w:val="2"/>
-        </w:numPr>
-        <w:spacing w:after="20"/>
-      </w:pPr>
-      <w:r>
-        <w:rPr>
-          <w:rFonts w:ascii="Calibri" w:cs="Calibri" w:eastAsia="Calibri" w:hAnsi="Calibri"/>
-          <w:sz w:val="20"/>
-          <w:szCs w:val="20"/>
-        </w:rPr>
-        <w:t xml:space="preserve">Per klasse is duidelijk welke inrichting standaard geldt.</w:t>
-      </w:r>
-    </w:p>
-    <w:p>
-      <w:pPr>
-        <w:pStyle w:val="ListParagraph"/>
-        <w:numPr>
-          <w:ilvl w:val="0"/>
-          <w:numId w:val="2"/>
-        </w:numPr>
-        <w:spacing w:after="20"/>
-      </w:pPr>
-      <w:r>
-        <w:rPr>
-          <w:rFonts w:ascii="Calibri" w:cs="Calibri" w:eastAsia="Calibri" w:hAnsi="Calibri"/>
-          <w:sz w:val="20"/>
-          <w:szCs w:val="20"/>
-        </w:rPr>
-        <w:t xml:space="preserve">Van elke afgedekte norm is bekend wat er tóch nog moet worden aangetoond.</w:t>
-      </w:r>
-    </w:p>
   </w:body>
 </w:document>
 </file>

</xml_diff>